<commit_message>
Rules document: end bonuses and playing on to the last place
Co-Authored-By: Claude Opus 5.5 <noreply@anthropic.com>
Claude-Session: https://claude.ai/code/session_017k16Wb7QGV9HECLycGRKhZ
</commit_message>
<xml_diff>
--- a/docs/rules-fa.docx
+++ b/docs/rules-fa.docx
@@ -4850,17 +4850,17 @@
           <w:szCs w:val="21"/>
           <w:rtl/>
         </w:rPr>
-        <w:t xml:space="preserve">برنده:</w:t>
-      </w:r>
-      <w:r>
-        <w:rPr>
-          <w:rFonts w:ascii="Vazirmatn" w:cs="Vazirmatn" w:eastAsia="Vazirmatn" w:hAnsi="Vazirmatn"/>
-          <w:color w:val="2B2B2B"/>
-          <w:sz w:val="21"/>
-          <w:szCs w:val="21"/>
-          <w:rtl/>
-        </w:rPr>
-        <w:t xml:space="preserve"> بازیکنی که همه‌ی مهره‌های همه‌ی رنگ‌هایش را در آشیانه بچیند.</w:t>
+        <w:t xml:space="preserve">برنده و جایگاه‌ها:</w:t>
+      </w:r>
+      <w:r>
+        <w:rPr>
+          <w:rFonts w:ascii="Vazirmatn" w:cs="Vazirmatn" w:eastAsia="Vazirmatn" w:hAnsi="Vazirmatn"/>
+          <w:color w:val="2B2B2B"/>
+          <w:sz w:val="21"/>
+          <w:szCs w:val="21"/>
+          <w:rtl/>
+        </w:rPr>
+        <w:t xml:space="preserve"> برنده بازیکنی است که اول همه‌ی مهره‌های همه‌ی رنگ‌هایش را در آشیانه بچیند. بازی ادامه پیدا می‌کند تا فقط یک بازیکن بماند؛ ترتیب تمام کردن، جایگاه‌ها را تعیین می‌کند (پاداش‌های پایانی در بخش ۱۱).</w:t>
       </w:r>
     </w:p>
     <w:p>
@@ -8425,6 +8425,562 @@
     </w:p>
     <w:p>
       <w:pPr>
+        <w:bidi/>
+        <w:spacing w:after="120" w:line="300"/>
+        <w:jc w:val="start"/>
+      </w:pPr>
+      <w:r>
+        <w:rPr>
+          <w:rFonts w:ascii="Vazirmatn" w:cs="Vazirmatn" w:eastAsia="Vazirmatn" w:hAnsi="Vazirmatn"/>
+          <w:b/>
+          <w:bCs/>
+          <w:color w:val="2B2B2B"/>
+          <w:sz w:val="21"/>
+          <w:szCs w:val="21"/>
+          <w:rtl/>
+        </w:rPr>
+        <w:t xml:space="preserve">پاداش‌های پایانی:</w:t>
+      </w:r>
+      <w:r>
+        <w:rPr>
+          <w:rFonts w:ascii="Vazirmatn" w:cs="Vazirmatn" w:eastAsia="Vazirmatn" w:hAnsi="Vazirmatn"/>
+          <w:color w:val="2B2B2B"/>
+          <w:sz w:val="21"/>
+          <w:szCs w:val="21"/>
+          <w:rtl/>
+        </w:rPr>
+        <w:t xml:space="preserve"> زدن اصل کار می‌ماند؛ این پاداش‌ها بازی دقیق و تمام کردن زودتر را هم بی‌جایزه نمی‌گذارند.</w:t>
+      </w:r>
+    </w:p>
+    <w:tbl>
+      <w:tblPr>
+        <w:bidiVisual/>
+        <w:tblW w:type="dxa" w:w="9638"/>
+        <w:tblBorders>
+          <w:top w:val="single" w:color="auto" w:sz="4"/>
+          <w:left w:val="single" w:color="auto" w:sz="4"/>
+          <w:bottom w:val="single" w:color="auto" w:sz="4"/>
+          <w:right w:val="single" w:color="auto" w:sz="4"/>
+          <w:insideH w:val="single" w:color="auto" w:sz="4"/>
+          <w:insideV w:val="single" w:color="auto" w:sz="4"/>
+        </w:tblBorders>
+        <w:tblLayout w:type="fixed"/>
+      </w:tblPr>
+      <w:tblGrid>
+        <w:gridCol w:w="2400"/>
+        <w:gridCol w:w="5200"/>
+        <w:gridCol w:w="2038"/>
+      </w:tblGrid>
+      <w:tr>
+        <w:trPr>
+          <w:tblHeader/>
+        </w:trPr>
+        <w:tc>
+          <w:tcPr>
+            <w:tcW w:type="dxa" w:w="2400"/>
+            <w:tcBorders>
+              <w:top w:val="single" w:color="D8D5CC" w:sz="4"/>
+              <w:left w:val="single" w:color="D8D5CC" w:sz="4"/>
+              <w:bottom w:val="single" w:color="D8D5CC" w:sz="4"/>
+              <w:right w:val="single" w:color="D8D5CC" w:sz="4"/>
+            </w:tcBorders>
+            <w:shd w:fill="F3EFE6" w:color="auto" w:val="clear"/>
+            <w:tcMar>
+              <w:top w:type="dxa" w:w="70"/>
+              <w:left w:type="dxa" w:w="110"/>
+              <w:bottom w:type="dxa" w:w="70"/>
+              <w:right w:type="dxa" w:w="110"/>
+            </w:tcMar>
+          </w:tcPr>
+          <w:p>
+            <w:pPr>
+              <w:bidi/>
+              <w:jc w:val="start"/>
+            </w:pPr>
+            <w:r>
+              <w:rPr>
+                <w:rFonts w:ascii="Vazirmatn" w:cs="Vazirmatn" w:eastAsia="Vazirmatn" w:hAnsi="Vazirmatn"/>
+                <w:b/>
+                <w:bCs/>
+                <w:color w:val="2B2B2B"/>
+                <w:sz w:val="19"/>
+                <w:szCs w:val="19"/>
+                <w:rtl/>
+              </w:rPr>
+              <w:t xml:space="preserve">پاداش</w:t>
+            </w:r>
+          </w:p>
+        </w:tc>
+        <w:tc>
+          <w:tcPr>
+            <w:tcW w:type="dxa" w:w="5200"/>
+            <w:tcBorders>
+              <w:top w:val="single" w:color="D8D5CC" w:sz="4"/>
+              <w:left w:val="single" w:color="D8D5CC" w:sz="4"/>
+              <w:bottom w:val="single" w:color="D8D5CC" w:sz="4"/>
+              <w:right w:val="single" w:color="D8D5CC" w:sz="4"/>
+            </w:tcBorders>
+            <w:shd w:fill="F3EFE6" w:color="auto" w:val="clear"/>
+            <w:tcMar>
+              <w:top w:type="dxa" w:w="70"/>
+              <w:left w:type="dxa" w:w="110"/>
+              <w:bottom w:type="dxa" w:w="70"/>
+              <w:right w:type="dxa" w:w="110"/>
+            </w:tcMar>
+          </w:tcPr>
+          <w:p>
+            <w:pPr>
+              <w:bidi/>
+              <w:jc w:val="start"/>
+            </w:pPr>
+            <w:r>
+              <w:rPr>
+                <w:rFonts w:ascii="Vazirmatn" w:cs="Vazirmatn" w:eastAsia="Vazirmatn" w:hAnsi="Vazirmatn"/>
+                <w:b/>
+                <w:bCs/>
+                <w:color w:val="2B2B2B"/>
+                <w:sz w:val="19"/>
+                <w:szCs w:val="19"/>
+                <w:rtl/>
+              </w:rPr>
+              <w:t xml:space="preserve">کِی</w:t>
+            </w:r>
+          </w:p>
+        </w:tc>
+        <w:tc>
+          <w:tcPr>
+            <w:tcW w:type="dxa" w:w="2038"/>
+            <w:tcBorders>
+              <w:top w:val="single" w:color="D8D5CC" w:sz="4"/>
+              <w:left w:val="single" w:color="D8D5CC" w:sz="4"/>
+              <w:bottom w:val="single" w:color="D8D5CC" w:sz="4"/>
+              <w:right w:val="single" w:color="D8D5CC" w:sz="4"/>
+            </w:tcBorders>
+            <w:shd w:fill="F3EFE6" w:color="auto" w:val="clear"/>
+            <w:tcMar>
+              <w:top w:type="dxa" w:w="70"/>
+              <w:left w:type="dxa" w:w="110"/>
+              <w:bottom w:type="dxa" w:w="70"/>
+              <w:right w:type="dxa" w:w="110"/>
+            </w:tcMar>
+          </w:tcPr>
+          <w:p>
+            <w:pPr>
+              <w:bidi/>
+              <w:jc w:val="start"/>
+            </w:pPr>
+            <w:r>
+              <w:rPr>
+                <w:rFonts w:ascii="Vazirmatn" w:cs="Vazirmatn" w:eastAsia="Vazirmatn" w:hAnsi="Vazirmatn"/>
+                <w:b/>
+                <w:bCs/>
+                <w:color w:val="2B2B2B"/>
+                <w:sz w:val="19"/>
+                <w:szCs w:val="19"/>
+                <w:rtl/>
+              </w:rPr>
+              <w:t xml:space="preserve">امتیاز</w:t>
+            </w:r>
+          </w:p>
+        </w:tc>
+      </w:tr>
+      <w:tr>
+        <w:trPr>
+          <w:cantSplit/>
+        </w:trPr>
+        <w:tc>
+          <w:tcPr>
+            <w:tcW w:type="dxa" w:w="2400"/>
+            <w:tcBorders>
+              <w:top w:val="single" w:color="D8D5CC" w:sz="4"/>
+              <w:left w:val="single" w:color="D8D5CC" w:sz="4"/>
+              <w:bottom w:val="single" w:color="D8D5CC" w:sz="4"/>
+              <w:right w:val="single" w:color="D8D5CC" w:sz="4"/>
+            </w:tcBorders>
+            <w:tcMar>
+              <w:top w:type="dxa" w:w="70"/>
+              <w:left w:type="dxa" w:w="110"/>
+              <w:bottom w:type="dxa" w:w="70"/>
+              <w:right w:type="dxa" w:w="110"/>
+            </w:tcMar>
+          </w:tcPr>
+          <w:p>
+            <w:pPr>
+              <w:bidi/>
+              <w:jc w:val="start"/>
+            </w:pPr>
+            <w:r>
+              <w:rPr>
+                <w:rFonts w:ascii="Vazirmatn" w:cs="Vazirmatn" w:eastAsia="Vazirmatn" w:hAnsi="Vazirmatn"/>
+                <w:b w:val="false"/>
+                <w:color w:val="2B2B2B"/>
+                <w:sz w:val="19"/>
+                <w:szCs w:val="19"/>
+                <w:rtl/>
+              </w:rPr>
+              <w:t xml:space="preserve">مهره‌ی سالم</w:t>
+            </w:r>
+          </w:p>
+        </w:tc>
+        <w:tc>
+          <w:tcPr>
+            <w:tcW w:type="dxa" w:w="5200"/>
+            <w:tcBorders>
+              <w:top w:val="single" w:color="D8D5CC" w:sz="4"/>
+              <w:left w:val="single" w:color="D8D5CC" w:sz="4"/>
+              <w:bottom w:val="single" w:color="D8D5CC" w:sz="4"/>
+              <w:right w:val="single" w:color="D8D5CC" w:sz="4"/>
+            </w:tcBorders>
+            <w:tcMar>
+              <w:top w:type="dxa" w:w="70"/>
+              <w:left w:type="dxa" w:w="110"/>
+              <w:bottom w:type="dxa" w:w="70"/>
+              <w:right w:type="dxa" w:w="110"/>
+            </w:tcMar>
+          </w:tcPr>
+          <w:p>
+            <w:pPr>
+              <w:bidi/>
+              <w:jc w:val="start"/>
+            </w:pPr>
+            <w:r>
+              <w:rPr>
+                <w:rFonts w:ascii="Vazirmatn" w:cs="Vazirmatn" w:eastAsia="Vazirmatn" w:hAnsi="Vazirmatn"/>
+                <w:b w:val="false"/>
+                <w:color w:val="2B2B2B"/>
+                <w:sz w:val="19"/>
+                <w:szCs w:val="19"/>
+                <w:rtl/>
+              </w:rPr>
+              <w:t xml:space="preserve">مهره‌ای که هیچ‌وقت زده نشده به آشیانه برسد</w:t>
+            </w:r>
+          </w:p>
+        </w:tc>
+        <w:tc>
+          <w:tcPr>
+            <w:tcW w:type="dxa" w:w="2038"/>
+            <w:tcBorders>
+              <w:top w:val="single" w:color="D8D5CC" w:sz="4"/>
+              <w:left w:val="single" w:color="D8D5CC" w:sz="4"/>
+              <w:bottom w:val="single" w:color="D8D5CC" w:sz="4"/>
+              <w:right w:val="single" w:color="D8D5CC" w:sz="4"/>
+            </w:tcBorders>
+            <w:tcMar>
+              <w:top w:type="dxa" w:w="70"/>
+              <w:left w:type="dxa" w:w="110"/>
+              <w:bottom w:type="dxa" w:w="70"/>
+              <w:right w:type="dxa" w:w="110"/>
+            </w:tcMar>
+          </w:tcPr>
+          <w:p>
+            <w:pPr>
+              <w:bidi/>
+              <w:jc w:val="start"/>
+            </w:pPr>
+            <w:r>
+              <w:rPr>
+                <w:rFonts w:ascii="Vazirmatn" w:cs="Vazirmatn" w:eastAsia="Vazirmatn" w:hAnsi="Vazirmatn"/>
+                <w:b w:val="false"/>
+                <w:color w:val="2B2B2B"/>
+                <w:sz w:val="19"/>
+                <w:szCs w:val="19"/>
+                <w:rtl/>
+              </w:rPr>
+              <w:t xml:space="preserve">+۵</w:t>
+            </w:r>
+          </w:p>
+        </w:tc>
+      </w:tr>
+      <w:tr>
+        <w:trPr>
+          <w:cantSplit/>
+        </w:trPr>
+        <w:tc>
+          <w:tcPr>
+            <w:tcW w:type="dxa" w:w="2400"/>
+            <w:tcBorders>
+              <w:top w:val="single" w:color="D8D5CC" w:sz="4"/>
+              <w:left w:val="single" w:color="D8D5CC" w:sz="4"/>
+              <w:bottom w:val="single" w:color="D8D5CC" w:sz="4"/>
+              <w:right w:val="single" w:color="D8D5CC" w:sz="4"/>
+            </w:tcBorders>
+            <w:tcMar>
+              <w:top w:type="dxa" w:w="70"/>
+              <w:left w:type="dxa" w:w="110"/>
+              <w:bottom w:type="dxa" w:w="70"/>
+              <w:right w:type="dxa" w:w="110"/>
+            </w:tcMar>
+          </w:tcPr>
+          <w:p>
+            <w:pPr>
+              <w:bidi/>
+              <w:jc w:val="start"/>
+            </w:pPr>
+            <w:r>
+              <w:rPr>
+                <w:rFonts w:ascii="Vazirmatn" w:cs="Vazirmatn" w:eastAsia="Vazirmatn" w:hAnsi="Vazirmatn"/>
+                <w:b w:val="false"/>
+                <w:color w:val="2B2B2B"/>
+                <w:sz w:val="19"/>
+                <w:szCs w:val="19"/>
+                <w:rtl/>
+              </w:rPr>
+              <w:t xml:space="preserve">رنگ کامل</w:t>
+            </w:r>
+          </w:p>
+        </w:tc>
+        <w:tc>
+          <w:tcPr>
+            <w:tcW w:type="dxa" w:w="5200"/>
+            <w:tcBorders>
+              <w:top w:val="single" w:color="D8D5CC" w:sz="4"/>
+              <w:left w:val="single" w:color="D8D5CC" w:sz="4"/>
+              <w:bottom w:val="single" w:color="D8D5CC" w:sz="4"/>
+              <w:right w:val="single" w:color="D8D5CC" w:sz="4"/>
+            </w:tcBorders>
+            <w:tcMar>
+              <w:top w:type="dxa" w:w="70"/>
+              <w:left w:type="dxa" w:w="110"/>
+              <w:bottom w:type="dxa" w:w="70"/>
+              <w:right w:type="dxa" w:w="110"/>
+            </w:tcMar>
+          </w:tcPr>
+          <w:p>
+            <w:pPr>
+              <w:bidi/>
+              <w:jc w:val="start"/>
+            </w:pPr>
+            <w:r>
+              <w:rPr>
+                <w:rFonts w:ascii="Vazirmatn" w:cs="Vazirmatn" w:eastAsia="Vazirmatn" w:hAnsi="Vazirmatn"/>
+                <w:b w:val="false"/>
+                <w:color w:val="2B2B2B"/>
+                <w:sz w:val="19"/>
+                <w:szCs w:val="19"/>
+                <w:rtl/>
+              </w:rPr>
+              <w:t xml:space="preserve">آخرین مهره‌ی یک رنگ به آشیانه برسد</w:t>
+            </w:r>
+          </w:p>
+        </w:tc>
+        <w:tc>
+          <w:tcPr>
+            <w:tcW w:type="dxa" w:w="2038"/>
+            <w:tcBorders>
+              <w:top w:val="single" w:color="D8D5CC" w:sz="4"/>
+              <w:left w:val="single" w:color="D8D5CC" w:sz="4"/>
+              <w:bottom w:val="single" w:color="D8D5CC" w:sz="4"/>
+              <w:right w:val="single" w:color="D8D5CC" w:sz="4"/>
+            </w:tcBorders>
+            <w:tcMar>
+              <w:top w:type="dxa" w:w="70"/>
+              <w:left w:type="dxa" w:w="110"/>
+              <w:bottom w:type="dxa" w:w="70"/>
+              <w:right w:type="dxa" w:w="110"/>
+            </w:tcMar>
+          </w:tcPr>
+          <w:p>
+            <w:pPr>
+              <w:bidi/>
+              <w:jc w:val="start"/>
+            </w:pPr>
+            <w:r>
+              <w:rPr>
+                <w:rFonts w:ascii="Vazirmatn" w:cs="Vazirmatn" w:eastAsia="Vazirmatn" w:hAnsi="Vazirmatn"/>
+                <w:b w:val="false"/>
+                <w:color w:val="2B2B2B"/>
+                <w:sz w:val="19"/>
+                <w:szCs w:val="19"/>
+                <w:rtl/>
+              </w:rPr>
+              <w:t xml:space="preserve">+۲۰</w:t>
+            </w:r>
+          </w:p>
+        </w:tc>
+      </w:tr>
+      <w:tr>
+        <w:trPr>
+          <w:cantSplit/>
+        </w:trPr>
+        <w:tc>
+          <w:tcPr>
+            <w:tcW w:type="dxa" w:w="2400"/>
+            <w:tcBorders>
+              <w:top w:val="single" w:color="D8D5CC" w:sz="4"/>
+              <w:left w:val="single" w:color="D8D5CC" w:sz="4"/>
+              <w:bottom w:val="single" w:color="D8D5CC" w:sz="4"/>
+              <w:right w:val="single" w:color="D8D5CC" w:sz="4"/>
+            </w:tcBorders>
+            <w:tcMar>
+              <w:top w:type="dxa" w:w="70"/>
+              <w:left w:type="dxa" w:w="110"/>
+              <w:bottom w:type="dxa" w:w="70"/>
+              <w:right w:type="dxa" w:w="110"/>
+            </w:tcMar>
+          </w:tcPr>
+          <w:p>
+            <w:pPr>
+              <w:bidi/>
+              <w:jc w:val="start"/>
+            </w:pPr>
+            <w:r>
+              <w:rPr>
+                <w:rFonts w:ascii="Vazirmatn" w:cs="Vazirmatn" w:eastAsia="Vazirmatn" w:hAnsi="Vazirmatn"/>
+                <w:b w:val="false"/>
+                <w:color w:val="2B2B2B"/>
+                <w:sz w:val="19"/>
+                <w:szCs w:val="19"/>
+                <w:rtl/>
+              </w:rPr>
+              <w:t xml:space="preserve">نفر اول / نفر دوم</w:t>
+            </w:r>
+          </w:p>
+        </w:tc>
+        <w:tc>
+          <w:tcPr>
+            <w:tcW w:type="dxa" w:w="5200"/>
+            <w:tcBorders>
+              <w:top w:val="single" w:color="D8D5CC" w:sz="4"/>
+              <w:left w:val="single" w:color="D8D5CC" w:sz="4"/>
+              <w:bottom w:val="single" w:color="D8D5CC" w:sz="4"/>
+              <w:right w:val="single" w:color="D8D5CC" w:sz="4"/>
+            </w:tcBorders>
+            <w:tcMar>
+              <w:top w:type="dxa" w:w="70"/>
+              <w:left w:type="dxa" w:w="110"/>
+              <w:bottom w:type="dxa" w:w="70"/>
+              <w:right w:type="dxa" w:w="110"/>
+            </w:tcMar>
+          </w:tcPr>
+          <w:p>
+            <w:pPr>
+              <w:bidi/>
+              <w:jc w:val="start"/>
+            </w:pPr>
+            <w:r>
+              <w:rPr>
+                <w:rFonts w:ascii="Vazirmatn" w:cs="Vazirmatn" w:eastAsia="Vazirmatn" w:hAnsi="Vazirmatn"/>
+                <w:b w:val="false"/>
+                <w:color w:val="2B2B2B"/>
+                <w:sz w:val="19"/>
+                <w:szCs w:val="19"/>
+                <w:rtl/>
+              </w:rPr>
+              <w:t xml:space="preserve">همه‌ی رنگ‌های بازیکن کامل شود</w:t>
+            </w:r>
+          </w:p>
+        </w:tc>
+        <w:tc>
+          <w:tcPr>
+            <w:tcW w:type="dxa" w:w="2038"/>
+            <w:tcBorders>
+              <w:top w:val="single" w:color="D8D5CC" w:sz="4"/>
+              <w:left w:val="single" w:color="D8D5CC" w:sz="4"/>
+              <w:bottom w:val="single" w:color="D8D5CC" w:sz="4"/>
+              <w:right w:val="single" w:color="D8D5CC" w:sz="4"/>
+            </w:tcBorders>
+            <w:tcMar>
+              <w:top w:type="dxa" w:w="70"/>
+              <w:left w:type="dxa" w:w="110"/>
+              <w:bottom w:type="dxa" w:w="70"/>
+              <w:right w:type="dxa" w:w="110"/>
+            </w:tcMar>
+          </w:tcPr>
+          <w:p>
+            <w:pPr>
+              <w:bidi/>
+              <w:jc w:val="start"/>
+            </w:pPr>
+            <w:r>
+              <w:rPr>
+                <w:rFonts w:ascii="Vazirmatn" w:cs="Vazirmatn" w:eastAsia="Vazirmatn" w:hAnsi="Vazirmatn"/>
+                <w:b w:val="false"/>
+                <w:color w:val="2B2B2B"/>
+                <w:sz w:val="19"/>
+                <w:szCs w:val="19"/>
+                <w:rtl/>
+              </w:rPr>
+              <w:t xml:space="preserve">+۵۰ / +۲۵</w:t>
+            </w:r>
+          </w:p>
+        </w:tc>
+      </w:tr>
+    </w:tbl>
+    <w:p>
+      <w:pPr>
+        <w:spacing w:after="120"/>
+      </w:pPr>
+    </w:p>
+    <w:p>
+      <w:pPr>
+        <w:pStyle w:val="ListParagraph"/>
+        <w:numPr>
+          <w:ilvl w:val="0"/>
+          <w:numId w:val="16"/>
+        </w:numPr>
+        <w:bidi/>
+        <w:spacing w:after="80" w:line="300"/>
+        <w:jc w:val="start"/>
+      </w:pPr>
+      <w:r>
+        <w:rPr>
+          <w:rFonts w:ascii="Vazirmatn" w:cs="Vazirmatn" w:eastAsia="Vazirmatn" w:hAnsi="Vazirmatn"/>
+          <w:b/>
+          <w:bCs/>
+          <w:color w:val="2B2B2B"/>
+          <w:sz w:val="21"/>
+          <w:szCs w:val="21"/>
+          <w:rtl/>
+        </w:rPr>
+        <w:t xml:space="preserve">امتیاز پایانی:</w:t>
+      </w:r>
+      <w:r>
+        <w:rPr>
+          <w:rFonts w:ascii="Vazirmatn" w:cs="Vazirmatn" w:eastAsia="Vazirmatn" w:hAnsi="Vazirmatn"/>
+          <w:color w:val="2B2B2B"/>
+          <w:sz w:val="21"/>
+          <w:szCs w:val="21"/>
+          <w:rtl/>
+        </w:rPr>
+        <w:t xml:space="preserve"> امتیازی که در پایان بازی می‌ماند؛ امتیاز خرج‌شده برای تونل برنمی‌گردد.</w:t>
+      </w:r>
+    </w:p>
+    <w:p>
+      <w:pPr>
+        <w:pStyle w:val="ListParagraph"/>
+        <w:numPr>
+          <w:ilvl w:val="0"/>
+          <w:numId w:val="16"/>
+        </w:numPr>
+        <w:bidi/>
+        <w:spacing w:after="80" w:line="300"/>
+        <w:jc w:val="start"/>
+      </w:pPr>
+      <w:r>
+        <w:rPr>
+          <w:rFonts w:ascii="Vazirmatn" w:cs="Vazirmatn" w:eastAsia="Vazirmatn" w:hAnsi="Vazirmatn"/>
+          <w:b/>
+          <w:bCs/>
+          <w:color w:val="2B2B2B"/>
+          <w:sz w:val="21"/>
+          <w:szCs w:val="21"/>
+          <w:rtl/>
+        </w:rPr>
+        <w:t xml:space="preserve">ادامه‌ی بازی:</w:t>
+      </w:r>
+      <w:r>
+        <w:rPr>
+          <w:rFonts w:ascii="Vazirmatn" w:cs="Vazirmatn" w:eastAsia="Vazirmatn" w:hAnsi="Vazirmatn"/>
+          <w:color w:val="2B2B2B"/>
+          <w:sz w:val="21"/>
+          <w:szCs w:val="21"/>
+          <w:rtl/>
+        </w:rPr>
+        <w:t xml:space="preserve"> بازیکنی که تمام کرده دیگر نوبت ندارد و تاس جایزه‌اش هم حذف می‌شود.</w:t>
+      </w:r>
+    </w:p>
+    <w:p>
+      <w:pPr>
         <w:keepNext/>
         <w:spacing w:after="60" w:before="160"/>
         <w:jc w:val="center"/>
@@ -9090,7 +9646,7 @@
         <w:pStyle w:val="ListParagraph"/>
         <w:numPr>
           <w:ilvl w:val="0"/>
-          <w:numId w:val="16"/>
+          <w:numId w:val="17"/>
         </w:numPr>
         <w:bidi/>
         <w:spacing w:after="80" w:line="300"/>
@@ -9124,7 +9680,7 @@
         <w:pStyle w:val="ListParagraph"/>
         <w:numPr>
           <w:ilvl w:val="0"/>
-          <w:numId w:val="16"/>
+          <w:numId w:val="17"/>
         </w:numPr>
         <w:bidi/>
         <w:spacing w:after="80" w:line="300"/>
@@ -9158,7 +9714,7 @@
         <w:pStyle w:val="ListParagraph"/>
         <w:numPr>
           <w:ilvl w:val="0"/>
-          <w:numId w:val="16"/>
+          <w:numId w:val="17"/>
         </w:numPr>
         <w:bidi/>
         <w:spacing w:after="80" w:line="300"/>
@@ -9233,7 +9789,7 @@
         <w:pStyle w:val="ListParagraph"/>
         <w:numPr>
           <w:ilvl w:val="0"/>
-          <w:numId w:val="17"/>
+          <w:numId w:val="18"/>
         </w:numPr>
         <w:bidi/>
         <w:spacing w:after="80" w:line="300"/>
@@ -9267,7 +9823,7 @@
         <w:pStyle w:val="ListParagraph"/>
         <w:numPr>
           <w:ilvl w:val="0"/>
-          <w:numId w:val="17"/>
+          <w:numId w:val="18"/>
         </w:numPr>
         <w:bidi/>
         <w:spacing w:after="80" w:line="300"/>
@@ -9301,7 +9857,7 @@
         <w:pStyle w:val="ListParagraph"/>
         <w:numPr>
           <w:ilvl w:val="0"/>
-          <w:numId w:val="17"/>
+          <w:numId w:val="18"/>
         </w:numPr>
         <w:bidi/>
         <w:spacing w:after="80" w:line="300"/>
@@ -9335,7 +9891,7 @@
         <w:pStyle w:val="ListParagraph"/>
         <w:numPr>
           <w:ilvl w:val="0"/>
-          <w:numId w:val="17"/>
+          <w:numId w:val="18"/>
         </w:numPr>
         <w:bidi/>
         <w:spacing w:after="80" w:line="300"/>
@@ -9369,7 +9925,7 @@
         <w:pStyle w:val="ListParagraph"/>
         <w:numPr>
           <w:ilvl w:val="0"/>
-          <w:numId w:val="17"/>
+          <w:numId w:val="18"/>
         </w:numPr>
         <w:bidi/>
         <w:spacing w:after="80" w:line="300"/>
@@ -9572,7 +10128,7 @@
         <w:pStyle w:val="ListParagraph"/>
         <w:numPr>
           <w:ilvl w:val="0"/>
-          <w:numId w:val="18"/>
+          <w:numId w:val="19"/>
         </w:numPr>
         <w:bidi/>
         <w:spacing w:after="80" w:line="300"/>
@@ -9606,7 +10162,7 @@
         <w:pStyle w:val="ListParagraph"/>
         <w:numPr>
           <w:ilvl w:val="0"/>
-          <w:numId w:val="18"/>
+          <w:numId w:val="19"/>
         </w:numPr>
         <w:bidi/>
         <w:spacing w:after="80" w:line="300"/>
@@ -9640,7 +10196,7 @@
         <w:pStyle w:val="ListParagraph"/>
         <w:numPr>
           <w:ilvl w:val="0"/>
-          <w:numId w:val="18"/>
+          <w:numId w:val="19"/>
         </w:numPr>
         <w:bidi/>
         <w:spacing w:after="80" w:line="300"/>
@@ -9674,7 +10230,7 @@
         <w:pStyle w:val="ListParagraph"/>
         <w:numPr>
           <w:ilvl w:val="0"/>
-          <w:numId w:val="18"/>
+          <w:numId w:val="19"/>
         </w:numPr>
         <w:bidi/>
         <w:spacing w:after="80" w:line="300"/>
@@ -9708,7 +10264,7 @@
         <w:pStyle w:val="ListParagraph"/>
         <w:numPr>
           <w:ilvl w:val="0"/>
-          <w:numId w:val="18"/>
+          <w:numId w:val="19"/>
         </w:numPr>
         <w:bidi/>
         <w:spacing w:after="80" w:line="300"/>
@@ -9742,7 +10298,7 @@
         <w:pStyle w:val="ListParagraph"/>
         <w:numPr>
           <w:ilvl w:val="0"/>
-          <w:numId w:val="18"/>
+          <w:numId w:val="19"/>
         </w:numPr>
         <w:bidi/>
         <w:spacing w:after="80" w:line="300"/>
@@ -9776,7 +10332,7 @@
         <w:pStyle w:val="ListParagraph"/>
         <w:numPr>
           <w:ilvl w:val="0"/>
-          <w:numId w:val="18"/>
+          <w:numId w:val="19"/>
         </w:numPr>
         <w:bidi/>
         <w:spacing w:after="80" w:line="300"/>
@@ -9810,7 +10366,7 @@
         <w:pStyle w:val="ListParagraph"/>
         <w:numPr>
           <w:ilvl w:val="0"/>
-          <w:numId w:val="18"/>
+          <w:numId w:val="19"/>
         </w:numPr>
         <w:bidi/>
         <w:spacing w:after="80" w:line="300"/>
@@ -9844,7 +10400,7 @@
         <w:pStyle w:val="ListParagraph"/>
         <w:numPr>
           <w:ilvl w:val="0"/>
-          <w:numId w:val="18"/>
+          <w:numId w:val="19"/>
         </w:numPr>
         <w:bidi/>
         <w:spacing w:after="80" w:line="300"/>
@@ -10939,7 +11495,7 @@
         <w:pStyle w:val="ListParagraph"/>
         <w:numPr>
           <w:ilvl w:val="0"/>
-          <w:numId w:val="19"/>
+          <w:numId w:val="20"/>
         </w:numPr>
         <w:bidi/>
         <w:spacing w:after="80" w:line="300"/>
@@ -10973,7 +11529,7 @@
         <w:pStyle w:val="ListParagraph"/>
         <w:numPr>
           <w:ilvl w:val="0"/>
-          <w:numId w:val="19"/>
+          <w:numId w:val="20"/>
         </w:numPr>
         <w:bidi/>
         <w:spacing w:after="80" w:line="300"/>
@@ -12394,6 +12950,426 @@
                 <w:szCs w:val="19"/>
                 <w:rtl w:val="false"/>
               </w:rPr>
+              <w:t xml:space="preserve">CLEAN_PIECE_BONUS</w:t>
+            </w:r>
+          </w:p>
+        </w:tc>
+        <w:tc>
+          <w:tcPr>
+            <w:tcW w:type="dxa" w:w="3300"/>
+            <w:tcBorders>
+              <w:top w:val="single" w:color="D8D5CC" w:sz="4"/>
+              <w:left w:val="single" w:color="D8D5CC" w:sz="4"/>
+              <w:bottom w:val="single" w:color="D8D5CC" w:sz="4"/>
+              <w:right w:val="single" w:color="D8D5CC" w:sz="4"/>
+            </w:tcBorders>
+            <w:tcMar>
+              <w:top w:type="dxa" w:w="70"/>
+              <w:left w:type="dxa" w:w="110"/>
+              <w:bottom w:type="dxa" w:w="70"/>
+              <w:right w:type="dxa" w:w="110"/>
+            </w:tcMar>
+          </w:tcPr>
+          <w:p>
+            <w:pPr>
+              <w:bidi/>
+              <w:jc w:val="start"/>
+            </w:pPr>
+            <w:r>
+              <w:rPr>
+                <w:rFonts w:ascii="Vazirmatn" w:cs="Vazirmatn" w:eastAsia="Vazirmatn" w:hAnsi="Vazirmatn"/>
+                <w:b w:val="false"/>
+                <w:color w:val="2B2B2B"/>
+                <w:sz w:val="19"/>
+                <w:szCs w:val="19"/>
+                <w:rtl/>
+              </w:rPr>
+              <w:t xml:space="preserve">پاداش مهره‌ی سالم در آشیانه</w:t>
+            </w:r>
+          </w:p>
+        </w:tc>
+        <w:tc>
+          <w:tcPr>
+            <w:tcW w:type="dxa" w:w="1700"/>
+            <w:tcBorders>
+              <w:top w:val="single" w:color="D8D5CC" w:sz="4"/>
+              <w:left w:val="single" w:color="D8D5CC" w:sz="4"/>
+              <w:bottom w:val="single" w:color="D8D5CC" w:sz="4"/>
+              <w:right w:val="single" w:color="D8D5CC" w:sz="4"/>
+            </w:tcBorders>
+            <w:tcMar>
+              <w:top w:type="dxa" w:w="70"/>
+              <w:left w:type="dxa" w:w="110"/>
+              <w:bottom w:type="dxa" w:w="70"/>
+              <w:right w:type="dxa" w:w="110"/>
+            </w:tcMar>
+          </w:tcPr>
+          <w:p>
+            <w:pPr>
+              <w:bidi/>
+              <w:jc w:val="start"/>
+            </w:pPr>
+            <w:r>
+              <w:rPr>
+                <w:rFonts w:ascii="Vazirmatn" w:cs="Vazirmatn" w:eastAsia="Vazirmatn" w:hAnsi="Vazirmatn"/>
+                <w:b w:val="false"/>
+                <w:color w:val="2B2B2B"/>
+                <w:sz w:val="19"/>
+                <w:szCs w:val="19"/>
+                <w:rtl/>
+              </w:rPr>
+              <w:t xml:space="preserve">۵</w:t>
+            </w:r>
+          </w:p>
+        </w:tc>
+        <w:tc>
+          <w:tcPr>
+            <w:tcW w:type="dxa" w:w="938"/>
+            <w:tcBorders>
+              <w:top w:val="single" w:color="D8D5CC" w:sz="4"/>
+              <w:left w:val="single" w:color="D8D5CC" w:sz="4"/>
+              <w:bottom w:val="single" w:color="D8D5CC" w:sz="4"/>
+              <w:right w:val="single" w:color="D8D5CC" w:sz="4"/>
+            </w:tcBorders>
+            <w:tcMar>
+              <w:top w:type="dxa" w:w="70"/>
+              <w:left w:type="dxa" w:w="110"/>
+              <w:bottom w:type="dxa" w:w="70"/>
+              <w:right w:type="dxa" w:w="110"/>
+            </w:tcMar>
+          </w:tcPr>
+          <w:p>
+            <w:pPr>
+              <w:bidi/>
+              <w:jc w:val="start"/>
+            </w:pPr>
+            <w:r>
+              <w:rPr>
+                <w:rFonts w:ascii="Vazirmatn" w:cs="Vazirmatn" w:eastAsia="Vazirmatn" w:hAnsi="Vazirmatn"/>
+                <w:b w:val="false"/>
+                <w:color w:val="2B2B2B"/>
+                <w:sz w:val="19"/>
+                <w:szCs w:val="19"/>
+                <w:rtl/>
+              </w:rPr>
+              <w:t xml:space="preserve">۱۱</w:t>
+            </w:r>
+          </w:p>
+        </w:tc>
+      </w:tr>
+      <w:tr>
+        <w:trPr>
+          <w:cantSplit/>
+        </w:trPr>
+        <w:tc>
+          <w:tcPr>
+            <w:tcW w:type="dxa" w:w="3700"/>
+            <w:tcBorders>
+              <w:top w:val="single" w:color="D8D5CC" w:sz="4"/>
+              <w:left w:val="single" w:color="D8D5CC" w:sz="4"/>
+              <w:bottom w:val="single" w:color="D8D5CC" w:sz="4"/>
+              <w:right w:val="single" w:color="D8D5CC" w:sz="4"/>
+            </w:tcBorders>
+            <w:tcMar>
+              <w:top w:type="dxa" w:w="70"/>
+              <w:left w:type="dxa" w:w="110"/>
+              <w:bottom w:type="dxa" w:w="70"/>
+              <w:right w:type="dxa" w:w="110"/>
+            </w:tcMar>
+          </w:tcPr>
+          <w:p>
+            <w:pPr>
+              <w:bidi w:val="false"/>
+              <w:jc w:val="left"/>
+            </w:pPr>
+            <w:r>
+              <w:rPr>
+                <w:rFonts w:ascii="Consolas" w:cs="Vazirmatn" w:hAnsi="Consolas"/>
+                <w:color w:val="8A3B1F"/>
+                <w:sz w:val="19"/>
+                <w:szCs w:val="19"/>
+                <w:rtl w:val="false"/>
+              </w:rPr>
+              <w:t xml:space="preserve">COLOR_BONUS</w:t>
+            </w:r>
+          </w:p>
+        </w:tc>
+        <w:tc>
+          <w:tcPr>
+            <w:tcW w:type="dxa" w:w="3300"/>
+            <w:tcBorders>
+              <w:top w:val="single" w:color="D8D5CC" w:sz="4"/>
+              <w:left w:val="single" w:color="D8D5CC" w:sz="4"/>
+              <w:bottom w:val="single" w:color="D8D5CC" w:sz="4"/>
+              <w:right w:val="single" w:color="D8D5CC" w:sz="4"/>
+            </w:tcBorders>
+            <w:tcMar>
+              <w:top w:type="dxa" w:w="70"/>
+              <w:left w:type="dxa" w:w="110"/>
+              <w:bottom w:type="dxa" w:w="70"/>
+              <w:right w:type="dxa" w:w="110"/>
+            </w:tcMar>
+          </w:tcPr>
+          <w:p>
+            <w:pPr>
+              <w:bidi/>
+              <w:jc w:val="start"/>
+            </w:pPr>
+            <w:r>
+              <w:rPr>
+                <w:rFonts w:ascii="Vazirmatn" w:cs="Vazirmatn" w:eastAsia="Vazirmatn" w:hAnsi="Vazirmatn"/>
+                <w:b w:val="false"/>
+                <w:color w:val="2B2B2B"/>
+                <w:sz w:val="19"/>
+                <w:szCs w:val="19"/>
+                <w:rtl/>
+              </w:rPr>
+              <w:t xml:space="preserve">پاداش کامل شدن یک رنگ</w:t>
+            </w:r>
+          </w:p>
+        </w:tc>
+        <w:tc>
+          <w:tcPr>
+            <w:tcW w:type="dxa" w:w="1700"/>
+            <w:tcBorders>
+              <w:top w:val="single" w:color="D8D5CC" w:sz="4"/>
+              <w:left w:val="single" w:color="D8D5CC" w:sz="4"/>
+              <w:bottom w:val="single" w:color="D8D5CC" w:sz="4"/>
+              <w:right w:val="single" w:color="D8D5CC" w:sz="4"/>
+            </w:tcBorders>
+            <w:tcMar>
+              <w:top w:type="dxa" w:w="70"/>
+              <w:left w:type="dxa" w:w="110"/>
+              <w:bottom w:type="dxa" w:w="70"/>
+              <w:right w:type="dxa" w:w="110"/>
+            </w:tcMar>
+          </w:tcPr>
+          <w:p>
+            <w:pPr>
+              <w:bidi/>
+              <w:jc w:val="start"/>
+            </w:pPr>
+            <w:r>
+              <w:rPr>
+                <w:rFonts w:ascii="Vazirmatn" w:cs="Vazirmatn" w:eastAsia="Vazirmatn" w:hAnsi="Vazirmatn"/>
+                <w:b w:val="false"/>
+                <w:color w:val="2B2B2B"/>
+                <w:sz w:val="19"/>
+                <w:szCs w:val="19"/>
+                <w:rtl/>
+              </w:rPr>
+              <w:t xml:space="preserve">۲۰</w:t>
+            </w:r>
+          </w:p>
+        </w:tc>
+        <w:tc>
+          <w:tcPr>
+            <w:tcW w:type="dxa" w:w="938"/>
+            <w:tcBorders>
+              <w:top w:val="single" w:color="D8D5CC" w:sz="4"/>
+              <w:left w:val="single" w:color="D8D5CC" w:sz="4"/>
+              <w:bottom w:val="single" w:color="D8D5CC" w:sz="4"/>
+              <w:right w:val="single" w:color="D8D5CC" w:sz="4"/>
+            </w:tcBorders>
+            <w:tcMar>
+              <w:top w:type="dxa" w:w="70"/>
+              <w:left w:type="dxa" w:w="110"/>
+              <w:bottom w:type="dxa" w:w="70"/>
+              <w:right w:type="dxa" w:w="110"/>
+            </w:tcMar>
+          </w:tcPr>
+          <w:p>
+            <w:pPr>
+              <w:bidi/>
+              <w:jc w:val="start"/>
+            </w:pPr>
+            <w:r>
+              <w:rPr>
+                <w:rFonts w:ascii="Vazirmatn" w:cs="Vazirmatn" w:eastAsia="Vazirmatn" w:hAnsi="Vazirmatn"/>
+                <w:b w:val="false"/>
+                <w:color w:val="2B2B2B"/>
+                <w:sz w:val="19"/>
+                <w:szCs w:val="19"/>
+                <w:rtl/>
+              </w:rPr>
+              <w:t xml:space="preserve">۱۱</w:t>
+            </w:r>
+          </w:p>
+        </w:tc>
+      </w:tr>
+      <w:tr>
+        <w:trPr>
+          <w:cantSplit/>
+        </w:trPr>
+        <w:tc>
+          <w:tcPr>
+            <w:tcW w:type="dxa" w:w="3700"/>
+            <w:tcBorders>
+              <w:top w:val="single" w:color="D8D5CC" w:sz="4"/>
+              <w:left w:val="single" w:color="D8D5CC" w:sz="4"/>
+              <w:bottom w:val="single" w:color="D8D5CC" w:sz="4"/>
+              <w:right w:val="single" w:color="D8D5CC" w:sz="4"/>
+            </w:tcBorders>
+            <w:tcMar>
+              <w:top w:type="dxa" w:w="70"/>
+              <w:left w:type="dxa" w:w="110"/>
+              <w:bottom w:type="dxa" w:w="70"/>
+              <w:right w:type="dxa" w:w="110"/>
+            </w:tcMar>
+          </w:tcPr>
+          <w:p>
+            <w:pPr>
+              <w:bidi w:val="false"/>
+              <w:jc w:val="left"/>
+            </w:pPr>
+            <w:r>
+              <w:rPr>
+                <w:rFonts w:ascii="Consolas" w:cs="Vazirmatn" w:hAnsi="Consolas"/>
+                <w:color w:val="8A3B1F"/>
+                <w:sz w:val="19"/>
+                <w:szCs w:val="19"/>
+                <w:rtl w:val="false"/>
+              </w:rPr>
+              <w:t xml:space="preserve">FINISH_BONUS</w:t>
+            </w:r>
+          </w:p>
+        </w:tc>
+        <w:tc>
+          <w:tcPr>
+            <w:tcW w:type="dxa" w:w="3300"/>
+            <w:tcBorders>
+              <w:top w:val="single" w:color="D8D5CC" w:sz="4"/>
+              <w:left w:val="single" w:color="D8D5CC" w:sz="4"/>
+              <w:bottom w:val="single" w:color="D8D5CC" w:sz="4"/>
+              <w:right w:val="single" w:color="D8D5CC" w:sz="4"/>
+            </w:tcBorders>
+            <w:tcMar>
+              <w:top w:type="dxa" w:w="70"/>
+              <w:left w:type="dxa" w:w="110"/>
+              <w:bottom w:type="dxa" w:w="70"/>
+              <w:right w:type="dxa" w:w="110"/>
+            </w:tcMar>
+          </w:tcPr>
+          <w:p>
+            <w:pPr>
+              <w:bidi/>
+              <w:jc w:val="start"/>
+            </w:pPr>
+            <w:r>
+              <w:rPr>
+                <w:rFonts w:ascii="Vazirmatn" w:cs="Vazirmatn" w:eastAsia="Vazirmatn" w:hAnsi="Vazirmatn"/>
+                <w:b w:val="false"/>
+                <w:color w:val="2B2B2B"/>
+                <w:sz w:val="19"/>
+                <w:szCs w:val="19"/>
+                <w:rtl/>
+              </w:rPr>
+              <w:t xml:space="preserve">پاداش نفر اول / دوم</w:t>
+            </w:r>
+          </w:p>
+        </w:tc>
+        <w:tc>
+          <w:tcPr>
+            <w:tcW w:type="dxa" w:w="1700"/>
+            <w:tcBorders>
+              <w:top w:val="single" w:color="D8D5CC" w:sz="4"/>
+              <w:left w:val="single" w:color="D8D5CC" w:sz="4"/>
+              <w:bottom w:val="single" w:color="D8D5CC" w:sz="4"/>
+              <w:right w:val="single" w:color="D8D5CC" w:sz="4"/>
+            </w:tcBorders>
+            <w:tcMar>
+              <w:top w:type="dxa" w:w="70"/>
+              <w:left w:type="dxa" w:w="110"/>
+              <w:bottom w:type="dxa" w:w="70"/>
+              <w:right w:type="dxa" w:w="110"/>
+            </w:tcMar>
+          </w:tcPr>
+          <w:p>
+            <w:pPr>
+              <w:bidi/>
+              <w:jc w:val="start"/>
+            </w:pPr>
+            <w:r>
+              <w:rPr>
+                <w:rFonts w:ascii="Vazirmatn" w:cs="Vazirmatn" w:eastAsia="Vazirmatn" w:hAnsi="Vazirmatn"/>
+                <w:b w:val="false"/>
+                <w:color w:val="2B2B2B"/>
+                <w:sz w:val="19"/>
+                <w:szCs w:val="19"/>
+                <w:rtl/>
+              </w:rPr>
+              <w:t xml:space="preserve">۵۰ / ۲۵</w:t>
+            </w:r>
+          </w:p>
+        </w:tc>
+        <w:tc>
+          <w:tcPr>
+            <w:tcW w:type="dxa" w:w="938"/>
+            <w:tcBorders>
+              <w:top w:val="single" w:color="D8D5CC" w:sz="4"/>
+              <w:left w:val="single" w:color="D8D5CC" w:sz="4"/>
+              <w:bottom w:val="single" w:color="D8D5CC" w:sz="4"/>
+              <w:right w:val="single" w:color="D8D5CC" w:sz="4"/>
+            </w:tcBorders>
+            <w:tcMar>
+              <w:top w:type="dxa" w:w="70"/>
+              <w:left w:type="dxa" w:w="110"/>
+              <w:bottom w:type="dxa" w:w="70"/>
+              <w:right w:type="dxa" w:w="110"/>
+            </w:tcMar>
+          </w:tcPr>
+          <w:p>
+            <w:pPr>
+              <w:bidi/>
+              <w:jc w:val="start"/>
+            </w:pPr>
+            <w:r>
+              <w:rPr>
+                <w:rFonts w:ascii="Vazirmatn" w:cs="Vazirmatn" w:eastAsia="Vazirmatn" w:hAnsi="Vazirmatn"/>
+                <w:b w:val="false"/>
+                <w:color w:val="2B2B2B"/>
+                <w:sz w:val="19"/>
+                <w:szCs w:val="19"/>
+                <w:rtl/>
+              </w:rPr>
+              <w:t xml:space="preserve">۱۱</w:t>
+            </w:r>
+          </w:p>
+        </w:tc>
+      </w:tr>
+      <w:tr>
+        <w:trPr>
+          <w:cantSplit/>
+        </w:trPr>
+        <w:tc>
+          <w:tcPr>
+            <w:tcW w:type="dxa" w:w="3700"/>
+            <w:tcBorders>
+              <w:top w:val="single" w:color="D8D5CC" w:sz="4"/>
+              <w:left w:val="single" w:color="D8D5CC" w:sz="4"/>
+              <w:bottom w:val="single" w:color="D8D5CC" w:sz="4"/>
+              <w:right w:val="single" w:color="D8D5CC" w:sz="4"/>
+            </w:tcBorders>
+            <w:tcMar>
+              <w:top w:type="dxa" w:w="70"/>
+              <w:left w:type="dxa" w:w="110"/>
+              <w:bottom w:type="dxa" w:w="70"/>
+              <w:right w:type="dxa" w:w="110"/>
+            </w:tcMar>
+          </w:tcPr>
+          <w:p>
+            <w:pPr>
+              <w:bidi w:val="false"/>
+              <w:jc w:val="left"/>
+            </w:pPr>
+            <w:r>
+              <w:rPr>
+                <w:rFonts w:ascii="Consolas" w:cs="Vazirmatn" w:hAnsi="Consolas"/>
+                <w:color w:val="8A3B1F"/>
+                <w:sz w:val="19"/>
+                <w:szCs w:val="19"/>
+                <w:rtl w:val="false"/>
+              </w:rPr>
               <w:t xml:space="preserve">FORT_ENABLED</w:t>
             </w:r>
           </w:p>
@@ -14216,7 +15192,7 @@
         <w:pStyle w:val="ListParagraph"/>
         <w:numPr>
           <w:ilvl w:val="0"/>
-          <w:numId w:val="20"/>
+          <w:numId w:val="21"/>
         </w:numPr>
         <w:bidi/>
         <w:spacing w:after="80" w:line="300"/>
@@ -14250,7 +15226,7 @@
         <w:pStyle w:val="ListParagraph"/>
         <w:numPr>
           <w:ilvl w:val="0"/>
-          <w:numId w:val="20"/>
+          <w:numId w:val="21"/>
         </w:numPr>
         <w:bidi/>
         <w:spacing w:after="80" w:line="300"/>
@@ -14284,7 +15260,7 @@
         <w:pStyle w:val="ListParagraph"/>
         <w:numPr>
           <w:ilvl w:val="0"/>
-          <w:numId w:val="20"/>
+          <w:numId w:val="21"/>
         </w:numPr>
         <w:bidi/>
         <w:spacing w:after="80" w:line="300"/>
@@ -14318,7 +15294,7 @@
         <w:pStyle w:val="ListParagraph"/>
         <w:numPr>
           <w:ilvl w:val="0"/>
-          <w:numId w:val="20"/>
+          <w:numId w:val="21"/>
         </w:numPr>
         <w:bidi/>
         <w:spacing w:after="80" w:line="300"/>
@@ -14372,7 +15348,7 @@
         <w:pStyle w:val="ListParagraph"/>
         <w:numPr>
           <w:ilvl w:val="0"/>
-          <w:numId w:val="20"/>
+          <w:numId w:val="21"/>
         </w:numPr>
         <w:bidi/>
         <w:spacing w:after="80" w:line="300"/>
@@ -14426,7 +15402,7 @@
         <w:pStyle w:val="ListParagraph"/>
         <w:numPr>
           <w:ilvl w:val="0"/>
-          <w:numId w:val="20"/>
+          <w:numId w:val="21"/>
         </w:numPr>
         <w:bidi/>
         <w:spacing w:after="80" w:line="300"/>
@@ -14501,7 +15477,7 @@
         <w:pStyle w:val="ListParagraph"/>
         <w:numPr>
           <w:ilvl w:val="0"/>
-          <w:numId w:val="21"/>
+          <w:numId w:val="22"/>
         </w:numPr>
         <w:bidi/>
         <w:spacing w:after="80" w:line="300"/>
@@ -14535,7 +15511,7 @@
         <w:pStyle w:val="ListParagraph"/>
         <w:numPr>
           <w:ilvl w:val="0"/>
-          <w:numId w:val="21"/>
+          <w:numId w:val="22"/>
         </w:numPr>
         <w:bidi/>
         <w:spacing w:after="80" w:line="300"/>
@@ -14569,7 +15545,7 @@
         <w:pStyle w:val="ListParagraph"/>
         <w:numPr>
           <w:ilvl w:val="0"/>
-          <w:numId w:val="21"/>
+          <w:numId w:val="22"/>
         </w:numPr>
         <w:bidi/>
         <w:spacing w:after="80" w:line="300"/>
@@ -15096,6 +16072,22 @@
     </w:lvl>
   </w:abstractNum>
   <w:abstractNum w:abstractNumId="21" w15:restartNumberingAfterBreak="0">
+    <w:multiLevelType w:val="hybridMultilevel"/>
+    <w:lvl w:ilvl="0" w:tentative="1">
+      <w:start w:val="1"/>
+      <w:numFmt w:val="bullet"/>
+      <w:lvlText w:val="•"/>
+      <w:lvlJc w:val="left"/>
+      <w:pPr>
+        <w:ind w:start="540" w:hanging="300"/>
+      </w:pPr>
+      <w:rPr>
+        <w:rFonts w:ascii="Vazirmatn" w:cs="Vazirmatn" w:eastAsia="Vazirmatn" w:hAnsi="Vazirmatn"/>
+        <w:rtl/>
+      </w:rPr>
+    </w:lvl>
+  </w:abstractNum>
+  <w:abstractNum w:abstractNumId="22" w15:restartNumberingAfterBreak="0">
     <w:multiLevelType w:val="hybridMultilevel"/>
     <w:lvl w:ilvl="0" w:tentative="1">
       <w:start w:val="1"/>
@@ -15233,6 +16225,12 @@
   </w:num>
   <w:num w:numId="21">
     <w:abstractNumId w:val="21"/>
+    <w:lvlOverride w:ilvl="0">
+      <w:startOverride w:val="1"/>
+    </w:lvlOverride>
+  </w:num>
+  <w:num w:numId="22">
+    <w:abstractNumId w:val="22"/>
     <w:lvlOverride w:ilvl="0">
       <w:startOverride w:val="1"/>
     </w:lvlOverride>

</xml_diff>

<commit_message>
A single 6 always throws again
- Bonus die after a pair: a 6 goes on with another die; from then on only a 6
  continues (the pair's number no longer does).
- Single-color game: every 6 throws again, as long as 6 comes.
- 6 next to another number in a two-dice throw still gives no bonus.
- Rules document and tests/golden.json updated.

Co-Authored-By: Claude Opus 5.5 <noreply@anthropic.com>
Claude-Session: https://claude.ai/code/session_017k16Wb7QGV9HECLycGRKhZ
</commit_message>
<xml_diff>
--- a/docs/rules-fa.docx
+++ b/docs/rules-fa.docx
@@ -5845,7 +5845,7 @@
           <w:szCs w:val="21"/>
           <w:rtl/>
         </w:rPr>
-        <w:t xml:space="preserve">تاس‌های یکسان جایزه دارند؛ یک ۶ تنها جایزه ندارد. جایزه شانس بازیکن است و حتی وقتی بی‌استفاده باشد یا اعلام شکستن ناموفق باشد، داده می‌شود.</w:t>
+        <w:t xml:space="preserve">تاس‌های یکسان جایزه دارند. یک ۶ تنها (در تاس تک) همیشه جایزه دارد، ولی ۶ کنار یک عدد دیگر در پرتاب دو تاس جایزه ندارد. جایزه شانس بازیکن است و حتی وقتی بی‌استفاده باشد یا اعلام شکستن ناموفق باشد، داده می‌شود.</w:t>
       </w:r>
     </w:p>
     <w:tbl>
@@ -6189,7 +6189,114 @@
                 <w:szCs w:val="19"/>
                 <w:rtl/>
               </w:rPr>
-              <w:t xml:space="preserve">اگر تاس جایزه همان عدد جفت باشد، دوباره یک تاس</w:t>
+              <w:t xml:space="preserve">اگر تاس جایزه همان عدد جفت یا ۶ باشد، دوباره یک تاس؛ بعد از یک ۶ فقط ۶ زنجیره را ادامه می‌دهد</w:t>
+            </w:r>
+          </w:p>
+        </w:tc>
+      </w:tr>
+      <w:tr>
+        <w:trPr>
+          <w:cantSplit/>
+        </w:trPr>
+        <w:tc>
+          <w:tcPr>
+            <w:tcW w:type="dxa" w:w="3300"/>
+            <w:tcBorders>
+              <w:top w:val="single" w:color="D8D5CC" w:sz="4"/>
+              <w:left w:val="single" w:color="D8D5CC" w:sz="4"/>
+              <w:bottom w:val="single" w:color="D8D5CC" w:sz="4"/>
+              <w:right w:val="single" w:color="D8D5CC" w:sz="4"/>
+            </w:tcBorders>
+            <w:tcMar>
+              <w:top w:type="dxa" w:w="70"/>
+              <w:left w:type="dxa" w:w="110"/>
+              <w:bottom w:type="dxa" w:w="70"/>
+              <w:right w:type="dxa" w:w="110"/>
+            </w:tcMar>
+          </w:tcPr>
+          <w:p>
+            <w:pPr>
+              <w:bidi/>
+              <w:jc w:val="start"/>
+            </w:pPr>
+            <w:r>
+              <w:rPr>
+                <w:rFonts w:ascii="Vazirmatn" w:cs="Vazirmatn" w:eastAsia="Vazirmatn" w:hAnsi="Vazirmatn"/>
+                <w:b w:val="false"/>
+                <w:color w:val="2B2B2B"/>
+                <w:sz w:val="19"/>
+                <w:szCs w:val="19"/>
+                <w:rtl/>
+              </w:rPr>
+              <w:t xml:space="preserve">۶ در تاس تک (تاس جایزه یا بازی تک‌رنگ)</w:t>
+            </w:r>
+          </w:p>
+        </w:tc>
+        <w:tc>
+          <w:tcPr>
+            <w:tcW w:type="dxa" w:w="2200"/>
+            <w:tcBorders>
+              <w:top w:val="single" w:color="D8D5CC" w:sz="4"/>
+              <w:left w:val="single" w:color="D8D5CC" w:sz="4"/>
+              <w:bottom w:val="single" w:color="D8D5CC" w:sz="4"/>
+              <w:right w:val="single" w:color="D8D5CC" w:sz="4"/>
+            </w:tcBorders>
+            <w:tcMar>
+              <w:top w:type="dxa" w:w="70"/>
+              <w:left w:type="dxa" w:w="110"/>
+              <w:bottom w:type="dxa" w:w="70"/>
+              <w:right w:type="dxa" w:w="110"/>
+            </w:tcMar>
+          </w:tcPr>
+          <w:p>
+            <w:pPr>
+              <w:bidi/>
+              <w:jc w:val="start"/>
+            </w:pPr>
+            <w:r>
+              <w:rPr>
+                <w:rFonts w:ascii="Vazirmatn" w:cs="Vazirmatn" w:eastAsia="Vazirmatn" w:hAnsi="Vazirmatn"/>
+                <w:b w:val="false"/>
+                <w:color w:val="2B2B2B"/>
+                <w:sz w:val="19"/>
+                <w:szCs w:val="19"/>
+                <w:rtl/>
+              </w:rPr>
+              <w:t xml:space="preserve">یک پرتاب یک تاس</w:t>
+            </w:r>
+          </w:p>
+        </w:tc>
+        <w:tc>
+          <w:tcPr>
+            <w:tcW w:type="dxa" w:w="4138"/>
+            <w:tcBorders>
+              <w:top w:val="single" w:color="D8D5CC" w:sz="4"/>
+              <w:left w:val="single" w:color="D8D5CC" w:sz="4"/>
+              <w:bottom w:val="single" w:color="D8D5CC" w:sz="4"/>
+              <w:right w:val="single" w:color="D8D5CC" w:sz="4"/>
+            </w:tcBorders>
+            <w:tcMar>
+              <w:top w:type="dxa" w:w="70"/>
+              <w:left w:type="dxa" w:w="110"/>
+              <w:bottom w:type="dxa" w:w="70"/>
+              <w:right w:type="dxa" w:w="110"/>
+            </w:tcMar>
+          </w:tcPr>
+          <w:p>
+            <w:pPr>
+              <w:bidi/>
+              <w:jc w:val="start"/>
+            </w:pPr>
+            <w:r>
+              <w:rPr>
+                <w:rFonts w:ascii="Vazirmatn" w:cs="Vazirmatn" w:eastAsia="Vazirmatn" w:hAnsi="Vazirmatn"/>
+                <w:b w:val="false"/>
+                <w:color w:val="2B2B2B"/>
+                <w:sz w:val="19"/>
+                <w:szCs w:val="19"/>
+                <w:rtl/>
+              </w:rPr>
+              <w:t xml:space="preserve">تا وقتی ۶ بیاید، دوباره یک تاس</w:t>
             </w:r>
           </w:p>
         </w:tc>
@@ -6955,6 +7062,40 @@
           <w:rtl/>
         </w:rPr>
         <w:t xml:space="preserve">قوانین پایه‌ی بخش ۳ برقرار است.</w:t>
+      </w:r>
+    </w:p>
+    <w:p>
+      <w:pPr>
+        <w:pStyle w:val="ListParagraph"/>
+        <w:numPr>
+          <w:ilvl w:val="0"/>
+          <w:numId w:val="11"/>
+        </w:numPr>
+        <w:bidi/>
+        <w:spacing w:after="80" w:line="300"/>
+        <w:jc w:val="start"/>
+      </w:pPr>
+      <w:r>
+        <w:rPr>
+          <w:rFonts w:ascii="Vazirmatn" w:cs="Vazirmatn" w:eastAsia="Vazirmatn" w:hAnsi="Vazirmatn"/>
+          <w:b/>
+          <w:bCs/>
+          <w:color w:val="2B2B2B"/>
+          <w:sz w:val="21"/>
+          <w:szCs w:val="21"/>
+          <w:rtl/>
+        </w:rPr>
+        <w:t xml:space="preserve">شش:</w:t>
+      </w:r>
+      <w:r>
+        <w:rPr>
+          <w:rFonts w:ascii="Vazirmatn" w:cs="Vazirmatn" w:eastAsia="Vazirmatn" w:hAnsi="Vazirmatn"/>
+          <w:color w:val="2B2B2B"/>
+          <w:sz w:val="21"/>
+          <w:szCs w:val="21"/>
+          <w:rtl/>
+        </w:rPr>
+        <w:t xml:space="preserve"> هر ۶ یک پرتاب دیگر می‌دهد، تا وقتی ۶ بیاید (بخش ۵).</w:t>
       </w:r>
     </w:p>
     <w:p>

</xml_diff>

<commit_message>
Ranks and tunnel costs: marshal from 4 captures, bounties 40 / 60, tunnels 80 / 120
- MARSHAL_AT 7 -> 4 (general still from 3 captures).
- Capturing a general: +40 / -40 (was 50); a marshal: +60 / -60 (was 70).
- Tunnel costs: 1 corridor 80 (was 100), 2 corridors 120 (was 175); 3 corridors stays 275.
- Rules document, Info window (reads the settings) and tests/golden.json updated.

Co-Authored-By: Claude Opus 5.5 <noreply@anthropic.com>
Claude-Session: https://claude.ai/code/session_017k16Wb7QGV9HECLycGRKhZ
</commit_message>
<xml_diff>
--- a/docs/rules-fa.docx
+++ b/docs/rules-fa.docx
@@ -9630,7 +9630,7 @@
                 <w:szCs w:val="19"/>
                 <w:rtl/>
               </w:rPr>
-              <w:t xml:space="preserve">زننده +۵۰ و صاحبش −۵۰، علاوه بر امتیاز عادی</w:t>
+              <w:t xml:space="preserve">زننده +۴۰ و صاحبش −۴۰، علاوه بر امتیاز عادی</w:t>
             </w:r>
           </w:p>
         </w:tc>
@@ -9703,7 +9703,7 @@
                 <w:szCs w:val="19"/>
                 <w:rtl/>
               </w:rPr>
-              <w:t xml:space="preserve">از هفتمین زدن</w:t>
+              <w:t xml:space="preserve">از چهارمین زدن</w:t>
             </w:r>
           </w:p>
         </w:tc>
@@ -9737,7 +9737,7 @@
                 <w:szCs w:val="19"/>
                 <w:rtl/>
               </w:rPr>
-              <w:t xml:space="preserve">×۳ از هشتمین زدن</w:t>
+              <w:t xml:space="preserve">×۳ از پنجمین زدن</w:t>
             </w:r>
           </w:p>
         </w:tc>
@@ -9771,7 +9771,7 @@
                 <w:szCs w:val="19"/>
                 <w:rtl/>
               </w:rPr>
-              <w:t xml:space="preserve">زننده +۷۰ و صاحبش −۷۰، علاوه بر امتیاز عادی</w:t>
+              <w:t xml:space="preserve">زننده +۶۰ و صاحبش −۶۰، علاوه بر امتیاز عادی</w:t>
             </w:r>
           </w:p>
         </w:tc>
@@ -10875,7 +10875,7 @@
                 <w:szCs w:val="19"/>
                 <w:rtl/>
               </w:rPr>
-              <w:t xml:space="preserve">۱۰۰</w:t>
+              <w:t xml:space="preserve">۸۰</w:t>
             </w:r>
           </w:p>
         </w:tc>
@@ -11016,7 +11016,7 @@
                 <w:szCs w:val="19"/>
                 <w:rtl/>
               </w:rPr>
-              <w:t xml:space="preserve">۱۷۵</w:t>
+              <w:t xml:space="preserve">۱۲۰</w:t>
             </w:r>
           </w:p>
         </w:tc>
@@ -13744,7 +13744,7 @@
                 <w:szCs w:val="19"/>
                 <w:rtl/>
               </w:rPr>
-              <w:t xml:space="preserve">۳ / ۷</w:t>
+              <w:t xml:space="preserve">۳ / ۴</w:t>
             </w:r>
           </w:p>
         </w:tc>
@@ -14074,7 +14074,7 @@
                 <w:szCs w:val="19"/>
                 <w:rtl/>
               </w:rPr>
-              <w:t xml:space="preserve">۵۰ / ۷۰</w:t>
+              <w:t xml:space="preserve">۴۰ / ۶۰</w:t>
             </w:r>
           </w:p>
         </w:tc>
@@ -14682,7 +14682,7 @@
                 <w:szCs w:val="19"/>
                 <w:rtl/>
               </w:rPr>
-              <w:t xml:space="preserve">۱۰۰ / ۱۷۵ / ۲۷۵</w:t>
+              <w:t xml:space="preserve">۸۰ / ۱۲۰ / ۲۷۵</w:t>
             </w:r>
           </w:p>
         </w:tc>

</xml_diff>

<commit_message>
Tunnel over 3 corridors: 160 points (was 275)
Costs are now 80 / 120 / 160; the most debt a tunnel can make is 160.
Rules document and tests/golden.json updated.

Co-Authored-By: Claude Opus 5.5 <noreply@anthropic.com>
Claude-Session: https://claude.ai/code/session_017k16Wb7QGV9HECLycGRKhZ
</commit_message>
<xml_diff>
--- a/docs/rules-fa.docx
+++ b/docs/rules-fa.docx
@@ -11157,7 +11157,7 @@
                 <w:szCs w:val="19"/>
                 <w:rtl/>
               </w:rPr>
-              <w:t xml:space="preserve">۲۷۵</w:t>
+              <w:t xml:space="preserve">۱۶۰</w:t>
             </w:r>
           </w:p>
         </w:tc>
@@ -11194,7 +11194,7 @@
           <w:szCs w:val="21"/>
           <w:rtl/>
         </w:rPr>
-        <w:t xml:space="preserve"> بازیکن با امتیاز صفر یا بیشتر می‌تواند تونل بگیرد، حتی اگر امتیازش منفی شود (حداکثر بدهی برابر هزینه‌ی تونل گرفته‌شده، یعنی حداکثر ۲۷۵). همه‌ی امتیازها بدهی را صاف می‌کنند. اگر مهره‌ی تونلی به آستانه برسد و صاحبش هنوز بدهکار باشد، وارد آشیانه نمی‌شود و یک دور کامل دیگر می‌زند؛ هر جا بدهی صاف شود، دوباره اجازه‌ی ورود دارد. این تنبیه فقط برای همان مهره است.</w:t>
+        <w:t xml:space="preserve"> بازیکن با امتیاز صفر یا بیشتر می‌تواند تونل بگیرد، حتی اگر امتیازش منفی شود (حداکثر بدهی برابر هزینه‌ی تونل گرفته‌شده، یعنی حداکثر ۱۶۰). همه‌ی امتیازها بدهی را صاف می‌کنند. اگر مهره‌ی تونلی به آستانه برسد و صاحبش هنوز بدهکار باشد، وارد آشیانه نمی‌شود و یک دور کامل دیگر می‌زند؛ هر جا بدهی صاف شود، دوباره اجازه‌ی ورود دارد. این تنبیه فقط برای همان مهره است.</w:t>
       </w:r>
     </w:p>
     <w:p>
@@ -14682,7 +14682,7 @@
                 <w:szCs w:val="19"/>
                 <w:rtl/>
               </w:rPr>
-              <w:t xml:space="preserve">۸۰ / ۱۲۰ / ۲۷۵</w:t>
+              <w:t xml:space="preserve">۸۰ / ۱۲۰ / ۱۶۰</w:t>
             </w:r>
           </w:p>
         </w:tc>

</xml_diff>

<commit_message>
Six first only with an own piece on the gate; Undo button; player names
- Six first (rules 4.5): the 6 must be played first only when a piece of that
  color stands on its own gate. With an empty gate the order is free, e.g. 5 for a
  piece on the board, then 6 to bring a new one in.
- Undo is always shown: active after the first move of a two-dice throw, greyed
  out otherwise; it takes the first move back.
- Player names can be typed on the setup screen (remembered in the browser).
- Rules document and tests/golden.json updated.

Co-Authored-By: Claude Opus 5.5 <noreply@anthropic.com>
Claude-Session: https://claude.ai/code/session_017k16Wb7QGV9HECLycGRKhZ
</commit_message>
<xml_diff>
--- a/docs/rules-fa.docx
+++ b/docs/rules-fa.docx
@@ -5709,7 +5709,7 @@
           <w:szCs w:val="21"/>
           <w:rtl/>
         </w:rPr>
-        <w:t xml:space="preserve"> وقتی دو تاس، که یکی ۶ است، به دو مهره‌ی مختلف از یک رنگ داده می‌شوند، اول ۶ بازی می‌شود. هدف: نباید بشود با عدد دیگر دروازه را خالی کرد تا با ۶ مهره‌ی جدید همان رنگ وارد شود. این قانون برای دو رنگ مختلف و برای جمع‌رو اجرا نمی‌شود.</w:t>
+        <w:t xml:space="preserve"> اگر روی دروازه‌ی یک رنگ مهره‌ی خودی باشد و یکی از تاس‌ها ۶ باشد، وقتی دو تاس به دو مهره‌ی مختلف از همان رنگ داده می‌شوند، اول ۶ بازی می‌شود. هدف: نباید بشود با عدد دیگر دروازه را خالی کرد تا با ۶ مهره‌ی جدید همان رنگ وارد شود. اگر دروازه خالی باشد، ترتیب آزاد است. این قانون برای دو رنگ مختلف و برای جمع‌رو اجرا نمی‌شود.</w:t>
       </w:r>
     </w:p>
     <w:p>
@@ -5805,6 +5805,28 @@
           <w:rtl/>
         </w:rPr>
         <w:t xml:space="preserve">مجاز: همان مهره‌ی آبی ۱۱ خانه برود.</w:t>
+      </w:r>
+    </w:p>
+    <w:p>
+      <w:pPr>
+        <w:pStyle w:val="ListParagraph"/>
+        <w:numPr>
+          <w:ilvl w:val="0"/>
+          <w:numId w:val="7"/>
+        </w:numPr>
+        <w:bidi/>
+        <w:spacing w:after="80" w:line="300"/>
+        <w:jc w:val="start"/>
+      </w:pPr>
+      <w:r>
+        <w:rPr>
+          <w:rFonts w:ascii="Vazirmatn" w:cs="Vazirmatn" w:eastAsia="Vazirmatn" w:hAnsi="Vazirmatn"/>
+          <w:color w:val="2B2B2B"/>
+          <w:sz w:val="21"/>
+          <w:szCs w:val="21"/>
+          <w:rtl/>
+        </w:rPr>
+        <w:t xml:space="preserve">مجاز (دروازه‌ی آبی خالی است، یک مهره‌ی آبی جای دیگری از صفحه است): آن مهره اول ۵ برود، بعد با ۶ آبی جدید وارد شود.</w:t>
       </w:r>
     </w:p>
     <w:p>

</xml_diff>

<commit_message>
Ranks by points instead of captures: general from 15, marshal from 25
A piece's rank comes from the points it wins with its own captures since it last
came in (with its rank multiplier and bounties); breaks do not count. GENERAL_POINTS
and MARSHAL_POINTS in the settings replace GENERAL_AT / MARSHAL_AT. The multiplier
applies to captures made after reaching the rank; a captured piece starts again as
a soldier. Rules document, Info window and tests/golden.json updated.

Co-Authored-By: Claude Opus 5.5 <noreply@anthropic.com>
Claude-Session: https://claude.ai/code/session_017k16Wb7QGV9HECLycGRKhZ
</commit_message>
<xml_diff>
--- a/docs/rules-fa.docx
+++ b/docs/rules-fa.docx
@@ -5060,7 +5060,7 @@
           <w:szCs w:val="21"/>
           <w:rtl/>
         </w:rPr>
-        <w:t xml:space="preserve"> مهره‌ای که زده شده؛ به حیاط برمی‌گردد و درجه و شمارنده‌ی زدن‌هایش از بین می‌رود.</w:t>
+        <w:t xml:space="preserve"> مهره‌ای که زده شده؛ به حیاط برمی‌گردد و درجه و امتیاز درجه‌اش از بین می‌رود.</w:t>
       </w:r>
     </w:p>
     <w:p>
@@ -8122,7 +8122,7 @@
           <w:szCs w:val="21"/>
           <w:rtl/>
         </w:rPr>
-        <w:t xml:space="preserve">بازیکن با زدن مهره‌های حریف و شکستن ساختارها امتیاز می‌گیرد؛ مهره‌هایی که زیاد می‌زنند درجه می‌گیرند و ارزش زدنشان برای حریف هم بالا می‌رود.</w:t>
+        <w:t xml:space="preserve">بازیکن با زدن مهره‌های حریف و شکستن ساختارها امتیاز می‌گیرد؛ مهره‌هایی که با زدن‌های خودشان امتیاز جمع کنند درجه می‌گیرند و ارزش زدنشان برای حریف هم بالا می‌رود.</w:t>
       </w:r>
     </w:p>
     <w:tbl>
@@ -9443,7 +9443,7 @@
                 <w:szCs w:val="19"/>
                 <w:rtl/>
               </w:rPr>
-              <w:t xml:space="preserve">کمتر از ۳ زدن</w:t>
+              <w:t xml:space="preserve">کمتر از ۱۵ امتیاز</w:t>
             </w:r>
           </w:p>
         </w:tc>
@@ -9584,7 +9584,7 @@
                 <w:szCs w:val="19"/>
                 <w:rtl/>
               </w:rPr>
-              <w:t xml:space="preserve">از سومین زدن</w:t>
+              <w:t xml:space="preserve">از ۱۵ امتیاز</w:t>
             </w:r>
           </w:p>
         </w:tc>
@@ -9618,7 +9618,7 @@
                 <w:szCs w:val="19"/>
                 <w:rtl/>
               </w:rPr>
-              <w:t xml:space="preserve">×۲ از چهارمین زدن</w:t>
+              <w:t xml:space="preserve">×۲</w:t>
             </w:r>
           </w:p>
         </w:tc>
@@ -9725,7 +9725,7 @@
                 <w:szCs w:val="19"/>
                 <w:rtl/>
               </w:rPr>
-              <w:t xml:space="preserve">از چهارمین زدن</w:t>
+              <w:t xml:space="preserve">از ۲۵ امتیاز</w:t>
             </w:r>
           </w:p>
         </w:tc>
@@ -9759,7 +9759,7 @@
                 <w:szCs w:val="19"/>
                 <w:rtl/>
               </w:rPr>
-              <w:t xml:space="preserve">×۳ از پنجمین زدن</w:t>
+              <w:t xml:space="preserve">×۳</w:t>
             </w:r>
           </w:p>
         </w:tc>
@@ -9825,17 +9825,17 @@
           <w:szCs w:val="21"/>
           <w:rtl/>
         </w:rPr>
-        <w:t xml:space="preserve">مرگ:</w:t>
-      </w:r>
-      <w:r>
-        <w:rPr>
-          <w:rFonts w:ascii="Vazirmatn" w:cs="Vazirmatn" w:eastAsia="Vazirmatn" w:hAnsi="Vazirmatn"/>
-          <w:color w:val="2B2B2B"/>
-          <w:sz w:val="21"/>
-          <w:szCs w:val="21"/>
-          <w:rtl/>
-        </w:rPr>
-        <w:t xml:space="preserve"> مهره‌ای که زده شود درجه و شمارنده‌اش را از دست می‌دهد و دوباره سرباز وارد می‌شود.</w:t>
+        <w:t xml:space="preserve">امتیاز درجه:</w:t>
+      </w:r>
+      <w:r>
+        <w:rPr>
+          <w:rFonts w:ascii="Vazirmatn" w:cs="Vazirmatn" w:eastAsia="Vazirmatn" w:hAnsi="Vazirmatn"/>
+          <w:color w:val="2B2B2B"/>
+          <w:sz w:val="21"/>
+          <w:szCs w:val="21"/>
+          <w:rtl/>
+        </w:rPr>
+        <w:t xml:space="preserve"> امتیازی که خود مهره با زدن‌هایش می‌گیرد (با ضریب درجه و امتیاز زدن ژنرال و مارشال) جمع می‌شود؛ با ۱۵ امتیاز ژنرال و با ۲۵ امتیاز مارشال می‌شود. ضریب از زدن بعد از رسیدن به درجه حساب می‌شود.</w:t>
       </w:r>
     </w:p>
     <w:p>
@@ -9859,6 +9859,40 @@
           <w:szCs w:val="21"/>
           <w:rtl/>
         </w:rPr>
+        <w:t xml:space="preserve">مرگ:</w:t>
+      </w:r>
+      <w:r>
+        <w:rPr>
+          <w:rFonts w:ascii="Vazirmatn" w:cs="Vazirmatn" w:eastAsia="Vazirmatn" w:hAnsi="Vazirmatn"/>
+          <w:color w:val="2B2B2B"/>
+          <w:sz w:val="21"/>
+          <w:szCs w:val="21"/>
+          <w:rtl/>
+        </w:rPr>
+        <w:t xml:space="preserve"> مهره‌ای که زده شود درجه و امتیاز درجه‌اش را از دست می‌دهد و دوباره سرباز وارد می‌شود.</w:t>
+      </w:r>
+    </w:p>
+    <w:p>
+      <w:pPr>
+        <w:pStyle w:val="ListParagraph"/>
+        <w:numPr>
+          <w:ilvl w:val="0"/>
+          <w:numId w:val="17"/>
+        </w:numPr>
+        <w:bidi/>
+        <w:spacing w:after="80" w:line="300"/>
+        <w:jc w:val="start"/>
+      </w:pPr>
+      <w:r>
+        <w:rPr>
+          <w:rFonts w:ascii="Vazirmatn" w:cs="Vazirmatn" w:eastAsia="Vazirmatn" w:hAnsi="Vazirmatn"/>
+          <w:b/>
+          <w:bCs/>
+          <w:color w:val="2B2B2B"/>
+          <w:sz w:val="21"/>
+          <w:szCs w:val="21"/>
+          <w:rtl/>
+        </w:rPr>
         <w:t xml:space="preserve">شکستن و درجه:</w:t>
       </w:r>
       <w:r>
@@ -9869,7 +9903,7 @@
           <w:szCs w:val="21"/>
           <w:rtl/>
         </w:rPr>
-        <w:t xml:space="preserve"> شرکت در شکستن ساختارها در شمارنده‌ی درجه حساب نمی‌شود، و ضریب درجه روی پاداش شکستن اعمال نمی‌شود (قابل تنظیم).</w:t>
+        <w:t xml:space="preserve"> شرکت در شکستن ساختارها در امتیاز درجه حساب نمی‌شود، و ضریب درجه روی پاداش شکستن اعمال نمی‌شود (قابل تنظیم).</w:t>
       </w:r>
     </w:p>
     <w:p>
@@ -13675,7 +13709,7 @@
                 <w:szCs w:val="19"/>
                 <w:rtl w:val="false"/>
               </w:rPr>
-              <w:t xml:space="preserve">GENERAL_AT</w:t>
+              <w:t xml:space="preserve">GENERAL_POINTS</w:t>
             </w:r>
             <w:r>
               <w:rPr>
@@ -13698,7 +13732,7 @@
                 <w:szCs w:val="19"/>
                 <w:rtl w:val="false"/>
               </w:rPr>
-              <w:t xml:space="preserve">MARSHAL_AT</w:t>
+              <w:t xml:space="preserve">MARSHAL_POINTS</w:t>
             </w:r>
           </w:p>
         </w:tc>
@@ -13732,7 +13766,7 @@
                 <w:szCs w:val="19"/>
                 <w:rtl/>
               </w:rPr>
-              <w:t xml:space="preserve">زدن لازم برای ژنرال / مارشال</w:t>
+              <w:t xml:space="preserve">امتیاز درجه‌ی لازم برای ژنرال / مارشال</w:t>
             </w:r>
           </w:p>
         </w:tc>
@@ -13766,7 +13800,7 @@
                 <w:szCs w:val="19"/>
                 <w:rtl/>
               </w:rPr>
-              <w:t xml:space="preserve">۳ / ۴</w:t>
+              <w:t xml:space="preserve">۱۵ / ۲۵</w:t>
             </w:r>
           </w:p>
         </w:tc>

</xml_diff>

<commit_message>
Bounties in proportion to the ranks: general 10, marshal 15
Capturing a general: +10 for the capturer, -10 for its owner (was 40); a marshal:
+15 / -15 (was 60). Rules document and tests/golden.json updated.

Co-Authored-By: Claude Opus 5.5 <noreply@anthropic.com>
Claude-Session: https://claude.ai/code/session_017k16Wb7QGV9HECLycGRKhZ
</commit_message>
<xml_diff>
--- a/docs/rules-fa.docx
+++ b/docs/rules-fa.docx
@@ -9652,7 +9652,7 @@
                 <w:szCs w:val="19"/>
                 <w:rtl/>
               </w:rPr>
-              <w:t xml:space="preserve">زننده +۴۰ و صاحبش −۴۰، علاوه بر امتیاز عادی</w:t>
+              <w:t xml:space="preserve">زننده +۱۰ و صاحبش −۱۰، علاوه بر امتیاز عادی</w:t>
             </w:r>
           </w:p>
         </w:tc>
@@ -9793,7 +9793,7 @@
                 <w:szCs w:val="19"/>
                 <w:rtl/>
               </w:rPr>
-              <w:t xml:space="preserve">زننده +۶۰ و صاحبش −۶۰، علاوه بر امتیاز عادی</w:t>
+              <w:t xml:space="preserve">زننده +۱۵ و صاحبش −۱۵، علاوه بر امتیاز عادی</w:t>
             </w:r>
           </w:p>
         </w:tc>
@@ -14130,7 +14130,7 @@
                 <w:szCs w:val="19"/>
                 <w:rtl/>
               </w:rPr>
-              <w:t xml:space="preserve">۴۰ / ۶۰</w:t>
+              <w:t xml:space="preserve">۱۰ / ۱۵</w:t>
             </w:r>
           </w:p>
         </w:tc>

</xml_diff>

<commit_message>
Hunter with a bow; move log in Info; a full nest shines and gives 100
- The hunter is now a pawn of its color holding a bow; the arrow points the way
  it runs (forward or backward). The waiting hunter is the same figure, pale, with ?.
- The move log is no longer in the side panel; it is at the end of the Info window,
  newest first, and scrolls.
- A full nest (a color complete): golden sparkles, then its fields keep a soft
  golden glow; COLOR_BONUS 20 -> 100. Rules document and tests/golden.json updated.

Co-Authored-By: Claude Opus 5.5 <noreply@anthropic.com>
Claude-Session: https://claude.ai/code/session_017k16Wb7QGV9HECLycGRKhZ
</commit_message>
<xml_diff>
--- a/docs/rules-fa.docx
+++ b/docs/rules-fa.docx
@@ -8888,7 +8888,7 @@
                 <w:szCs w:val="19"/>
                 <w:rtl/>
               </w:rPr>
-              <w:t xml:space="preserve">رنگ کامل</w:t>
+              <w:t xml:space="preserve">آشیانه‌ی پر</w:t>
             </w:r>
           </w:p>
         </w:tc>
@@ -8922,7 +8922,7 @@
                 <w:szCs w:val="19"/>
                 <w:rtl/>
               </w:rPr>
-              <w:t xml:space="preserve">آخرین مهره‌ی یک رنگ به آشیانه برسد</w:t>
+              <w:t xml:space="preserve">آخرین مهره‌ی یک رنگ به آشیانه برسد (آشیانه می‌درخشد)</w:t>
             </w:r>
           </w:p>
         </w:tc>
@@ -8956,7 +8956,7 @@
                 <w:szCs w:val="19"/>
                 <w:rtl/>
               </w:rPr>
-              <w:t xml:space="preserve">+۲۰</w:t>
+              <w:t xml:space="preserve">+۱۰۰</w:t>
             </w:r>
           </w:p>
         </w:tc>
@@ -13321,7 +13321,7 @@
                 <w:szCs w:val="19"/>
                 <w:rtl/>
               </w:rPr>
-              <w:t xml:space="preserve">پاداش کامل شدن یک رنگ</w:t>
+              <w:t xml:space="preserve">پاداش پر شدن آشیانه (کامل شدن یک رنگ)</w:t>
             </w:r>
           </w:p>
         </w:tc>
@@ -13355,7 +13355,7 @@
                 <w:szCs w:val="19"/>
                 <w:rtl/>
               </w:rPr>
-              <w:t xml:space="preserve">۲۰</w:t>
+              <w:t xml:space="preserve">۱۰۰</w:t>
             </w:r>
           </w:p>
         </w:tc>

</xml_diff>

<commit_message>
End bonuses per board (from simulations); triple-dice card effect
- 6-color board: full nest 60, first / second to finish 100 / 50.
  4-color board: full nest 25, first / second 40 / 20 (its corridor points are smaller).
  In computer games captures now make 60-80% of the points won, and finishing first
  is worth more than one full nest.
- Playing a triple-dice card: the card with the three dice flies in over the board
  and the dice glow for 2 seconds (for every player); the game waits meanwhile.
- Rules document and tests/golden.json updated.

Co-Authored-By: Claude Opus 5.5 <noreply@anthropic.com>
Claude-Session: https://claude.ai/code/session_017k16Wb7QGV9HECLycGRKhZ
</commit_message>
<xml_diff>
--- a/docs/rules-fa.docx
+++ b/docs/rules-fa.docx
@@ -8612,7 +8612,7 @@
           <w:szCs w:val="21"/>
           <w:rtl/>
         </w:rPr>
-        <w:t xml:space="preserve"> زدن اصل کار می‌ماند؛ این پاداش‌ها بازی دقیق و تمام کردن زودتر را هم بی‌جایزه نمی‌گذارند.</w:t>
+        <w:t xml:space="preserve"> زدن اصل کار می‌ماند؛ این پاداش‌ها بازی دقیق و تمام کردن زودتر را هم بی‌جایزه نمی‌گذارند. عددها برای هر صفحه جداست، چون امتیاز دالان‌های صفحه‌ی ۴ رنگ کمتر است؛ در شبیه‌سازی، زدن ۶۰ تا ۸۰ درصد امتیازها را می‌سازد و پاداش نفر اول از یک آشیانه‌ی پر بیشتر است.</w:t>
       </w:r>
     </w:p>
     <w:tbl>
@@ -8956,7 +8956,7 @@
                 <w:szCs w:val="19"/>
                 <w:rtl/>
               </w:rPr>
-              <w:t xml:space="preserve">+۱۰۰</w:t>
+              <w:t xml:space="preserve">۶ رنگ: +۶۰ · ۴ رنگ: +۲۵</w:t>
             </w:r>
           </w:p>
         </w:tc>
@@ -9063,7 +9063,7 @@
                 <w:szCs w:val="19"/>
                 <w:rtl/>
               </w:rPr>
-              <w:t xml:space="preserve">+۵۰ / +۲۵</w:t>
+              <w:t xml:space="preserve">۶ رنگ: +۱۰۰ / +۵۰ · ۴ رنگ: +۴۰ / +۲۰</w:t>
             </w:r>
           </w:p>
         </w:tc>
@@ -13355,7 +13355,7 @@
                 <w:szCs w:val="19"/>
                 <w:rtl/>
               </w:rPr>
-              <w:t xml:space="preserve">۱۰۰</w:t>
+              <w:t xml:space="preserve">۶۰ (صفحه‌ی ۴ رنگ: ۲۵)</w:t>
             </w:r>
           </w:p>
         </w:tc>
@@ -13495,7 +13495,7 @@
                 <w:szCs w:val="19"/>
                 <w:rtl/>
               </w:rPr>
-              <w:t xml:space="preserve">۵۰ / ۲۵</w:t>
+              <w:t xml:space="preserve">۱۰۰ / ۵۰ (صفحه‌ی ۴ رنگ: ۴۰ / ۲۰)</w:t>
             </w:r>
           </w:p>
         </w:tc>

</xml_diff>

<commit_message>
Ranked pieces survive a hit: one rank down and pushed back; blast effect
A hit general becomes a soldier and a hit marshal becomes a general. The piece
is pushed back to the first free field behind it and its rank points reset to
the start of the new rank. Soldiers still go to the yard; scoring is unchanged.
Applies to normal captures, wall/castle breaks, tunnel exits and hunters.
A flash, shock ring, sparks and a short camera shake mark the hit.

Co-Authored-By: Claude Opus 5.5 <noreply@anthropic.com>
Claude-Session: https://claude.ai/code/session_017k16Wb7QGV9HECLycGRKhZ
</commit_message>
<xml_diff>
--- a/docs/rules-fa.docx
+++ b/docs/rules-fa.docx
@@ -5060,7 +5060,7 @@
           <w:szCs w:val="21"/>
           <w:rtl/>
         </w:rPr>
-        <w:t xml:space="preserve"> مهره‌ای که زده شده؛ به حیاط برمی‌گردد و درجه و امتیاز درجه‌اش از بین می‌رود.</w:t>
+        <w:t xml:space="preserve"> سربازی که زده شده؛ به حیاط برمی‌گردد. ژنرال و مارشال زده‌شده نمی‌میرند، فقط یک درجه پایین می‌آیند.</w:t>
       </w:r>
     </w:p>
     <w:p>
@@ -5400,7 +5400,7 @@
           <w:szCs w:val="21"/>
           <w:rtl/>
         </w:rPr>
-        <w:t xml:space="preserve"> مهره‌ای که روی خانه‌ی مهره‌ی حریف فرود بیاید، آن را به حیاطش برمی‌گرداند.</w:t>
+        <w:t xml:space="preserve"> مهره‌ای که روی خانه‌ی مهره‌ی حریف فرود بیاید، آن را می‌زند: سرباز به حیاطش برمی‌گردد و ژنرال یا مارشال یک درجه پایین می‌آید (بند «مرگ و تنزل درجه»).</w:t>
       </w:r>
     </w:p>
     <w:p>
@@ -9859,17 +9859,17 @@
           <w:szCs w:val="21"/>
           <w:rtl/>
         </w:rPr>
-        <w:t xml:space="preserve">مرگ:</w:t>
-      </w:r>
-      <w:r>
-        <w:rPr>
-          <w:rFonts w:ascii="Vazirmatn" w:cs="Vazirmatn" w:eastAsia="Vazirmatn" w:hAnsi="Vazirmatn"/>
-          <w:color w:val="2B2B2B"/>
-          <w:sz w:val="21"/>
-          <w:szCs w:val="21"/>
-          <w:rtl/>
-        </w:rPr>
-        <w:t xml:space="preserve"> مهره‌ای که زده شود درجه و امتیاز درجه‌اش را از دست می‌دهد و دوباره سرباز وارد می‌شود.</w:t>
+        <w:t xml:space="preserve">مرگ و تنزل درجه:</w:t>
+      </w:r>
+      <w:r>
+        <w:rPr>
+          <w:rFonts w:ascii="Vazirmatn" w:cs="Vazirmatn" w:eastAsia="Vazirmatn" w:hAnsi="Vazirmatn"/>
+          <w:color w:val="2B2B2B"/>
+          <w:sz w:val="21"/>
+          <w:szCs w:val="21"/>
+          <w:rtl/>
+        </w:rPr>
+        <w:t xml:space="preserve"> سربازی که زده شود به حیاط برمی‌گردد. ژنرالِ زده‌شده سرباز می‌شود و مارشالِ زده‌شده ژنرال؛ مهره روی تخته می‌ماند و به اولین خانه‌ی خالیِ پشت سرش عقب رانده می‌شود و مهاجم جای او را می‌گیرد. امتیاز درجه‌اش به شروع درجه‌ی تازه برمی‌گردد (ژنرال ۱۵، سرباز ۰). اگر پشت سرش خانه‌ی خالی نباشد، به حیاط برمی‌گردد. امتیازها مثل قبل است: زننده امتیاز عادی به‌اضافه‌ی جایزه‌ی سر می‌گیرد و صاحب مهره جایزه‌ی سر را از دست می‌دهد. این قانون همه‌جا اجرا می‌شود: زدن معمولی، شکستن دیوار و قلعه، خروج از تونل و شکارچی (شکارچی خلاف جهت حرکتش عقب می‌رود). با زدن ژنرال یا مارشال، انفجاری روی خانه دیده می‌شود و تخته می‌لرزد.</w:t>
       </w:r>
     </w:p>
     <w:p>

</xml_diff>

<commit_message>
Computer plays triple-dice cards behind a castle; nest swap rule
* AI: the bar for a triple-dice card drops by AI_WEIGHTS.cardBlocked (5) while one of
  the player's pawns has an opponent castle within six fields ahead. In the castle
  scenario the owner reported, cards went from 0/20 to 20/20; win rates unchanged in
  simulation. Pace-based spending (cardPace) lost, so it stays 0.
* Rule NEST_SWAP: with a 6, a soldier in the nest with rank points swaps with a yard
  pawn and comes out on the gate with its points; the yard pawn takes its nest field.
  The computer values points in play (AI_WEIGHTS.points) and uses it.
* Golden games re-recorded; rules-fa and both handoffs updated.

Co-Authored-By: Claude Opus 5.5 <noreply@anthropic.com>
Claude-Session: https://claude.ai/code/session_017k16WYeWi3jpCkyXCnv6BD
</commit_message>
<xml_diff>
--- a/docs/rules-fa.docx
+++ b/docs/rules-fa.docx
@@ -9904,6 +9904,40 @@
           <w:rtl/>
         </w:rPr>
         <w:t xml:space="preserve"> شرکت در شکستن ساختارها در امتیاز درجه حساب نمی‌شود، و ضریب درجه روی پاداش شکستن اعمال نمی‌شود (قابل تنظیم).</w:t>
+      </w:r>
+    </w:p>
+    <w:p>
+      <w:pPr>
+        <w:pStyle w:val="ListParagraph"/>
+        <w:numPr>
+          <w:ilvl w:val="0"/>
+          <w:numId w:val="17"/>
+        </w:numPr>
+        <w:bidi/>
+        <w:spacing w:after="80" w:line="300"/>
+        <w:jc w:val="start"/>
+      </w:pPr>
+      <w:r>
+        <w:rPr>
+          <w:rFonts w:ascii="Vazirmatn" w:cs="Vazirmatn" w:eastAsia="Vazirmatn" w:hAnsi="Vazirmatn"/>
+          <w:b/>
+          <w:bCs/>
+          <w:color w:val="2B2B2B"/>
+          <w:sz w:val="21"/>
+          <w:szCs w:val="21"/>
+          <w:rtl/>
+        </w:rPr>
+        <w:t xml:space="preserve">جابه‌جایی از آشیانه:</w:t>
+      </w:r>
+      <w:r>
+        <w:rPr>
+          <w:rFonts w:ascii="Vazirmatn" w:cs="Vazirmatn" w:eastAsia="Vazirmatn" w:hAnsi="Vazirmatn"/>
+          <w:color w:val="2B2B2B"/>
+          <w:sz w:val="21"/>
+          <w:szCs w:val="21"/>
+          <w:rtl/>
+        </w:rPr>
+        <w:t xml:space="preserve"> سربازی که در آشیانه است و امتیاز درجه دارد (کمتر از ۱۵)، اگر رنگش مهره‌ای در حیاط داشته باشد، می‌تواند یک ۶ را به‌جای وارد کردن مهره برای جابه‌جایی خرج کند: خودش با امتیازهایش روی دروازه می‌آید و مهره‌ی حیاط جای او را در آشیانه می‌گیرد. اگر بعداً زده شود، مثل هر سربازی به حیاط برمی‌گردد و امتیازش صفر می‌شود. این جابه‌جایی برای هیچ‌کدام از دو مهره پاداش مهره‌ی سالم ندارد. ژنرال و مارشال جابه‌جا نمی‌شوند.</w:t>
       </w:r>
     </w:p>
     <w:p>

</xml_diff>

<commit_message>
Version 1.0.3: the one-color game is the traditional game; several colors keep everything
v1.0.1 and v1.0.2 turned tunnels and castle-break declarations off everywhere; the owner
meant it per mode. Config.forBoard(n, level, "one") now turns off, on both boards: ranks
(and so the nest swap), tunnels, castles (new CASTLES flag: a run of 3+ is walls of two
and a lone piece) and castle-break declarations. The game with several colors per player
has all of them again. Tests, golden games, rules-fa, handoffs, README, CHANGELOG updated.

Co-Authored-By: Claude Opus 5.5 <noreply@anthropic.com>
Claude-Session: https://claude.ai/code/session_017k16WYeWi3jpCkyXCnv6BD
</commit_message>
<xml_diff>
--- a/docs/rules-fa.docx
+++ b/docs/rules-fa.docx
@@ -7882,7 +7882,7 @@
           <w:szCs w:val="21"/>
           <w:rtl/>
         </w:rPr>
-        <w:t xml:space="preserve"> (در نسخه‌ی ۱ بازی نیست و برای نسخه‌های بعد است؛ در نسخه‌ی ۱ قلعه شکسته نمی‌شود.) قبل از پرتاب اعلام می‌شود، محدودیت تعداد ندارد و از کارت سه‌تاس کم نمی‌کند. اگر ناموفق باشد، نوبت بازیکن می‌سوزد، ولی جایزه‌ی تاس‌های یکسان (بخش ۵) داده می‌شود.</w:t>
+        <w:t xml:space="preserve"> (فقط در بازی چندرنگ؛ بازی تک‌رنگ قلعه ندارد.) قبل از پرتاب اعلام می‌شود، محدودیت تعداد ندارد و از کارت سه‌تاس کم نمی‌کند. اگر ناموفق باشد، نوبت بازیکن می‌سوزد، ولی جایزه‌ی تاس‌های یکسان (بخش ۵) داده می‌شود.</w:t>
       </w:r>
     </w:p>
     <w:p>
@@ -9961,6 +9961,40 @@
           <w:szCs w:val="21"/>
           <w:rtl/>
         </w:rPr>
+        <w:t xml:space="preserve">بازی تک‌رنگ (سنتی)، هر دو صفحه:</w:t>
+      </w:r>
+      <w:r>
+        <w:rPr>
+          <w:rFonts w:ascii="Vazirmatn" w:cs="Vazirmatn" w:eastAsia="Vazirmatn" w:hAnsi="Vazirmatn"/>
+          <w:color w:val="2B2B2B"/>
+          <w:sz w:val="21"/>
+          <w:szCs w:val="21"/>
+          <w:rtl/>
+        </w:rPr>
+        <w:t xml:space="preserve"> ژنرال و مارشال ندارد؛ همه‌ی مهره‌ها سرباز می‌مانند (بدون ضریب، بدون جایزه‌ی سر، زده‌شده به حیاط برمی‌گردد) و جابه‌جایی از آشیانه هم نیست. تونل و قلعه هم ندارد: سه مهره یا بیشتر پشت سر هم فقط یک دیوار دوتایی و یک مهره‌ی تنهاست، پس اعلام قلعه‌شکن هم نیست. بقیه‌ی امتیازها مثل قبل است. بازی‌ای که هر بازیکن چند رنگ دارد همه‌ی این‌ها را دارد. (همه قابل تنظیم‌اند.)</w:t>
+      </w:r>
+    </w:p>
+    <w:p>
+      <w:pPr>
+        <w:pStyle w:val="ListParagraph"/>
+        <w:numPr>
+          <w:ilvl w:val="0"/>
+          <w:numId w:val="17"/>
+        </w:numPr>
+        <w:bidi/>
+        <w:spacing w:after="80" w:line="300"/>
+        <w:jc w:val="start"/>
+      </w:pPr>
+      <w:r>
+        <w:rPr>
+          <w:rFonts w:ascii="Vazirmatn" w:cs="Vazirmatn" w:eastAsia="Vazirmatn" w:hAnsi="Vazirmatn"/>
+          <w:b/>
+          <w:bCs/>
+          <w:color w:val="2B2B2B"/>
+          <w:sz w:val="21"/>
+          <w:szCs w:val="21"/>
+          <w:rtl/>
+        </w:rPr>
         <w:t xml:space="preserve">کمین:</w:t>
       </w:r>
       <w:r>
@@ -10287,7 +10321,7 @@
           <w:szCs w:val="21"/>
           <w:rtl/>
         </w:rPr>
-        <w:t xml:space="preserve">(تونل در نسخه‌ی ۱ بازی نیست و برای نسخه‌های بعد است.) بازیکنی که عقب افتاده می‌تواند با خرج امتیاز از تونل، میان‌بری امن از وسط یک دالان به وسط دالانی جلوتر برود.</w:t>
+        <w:t xml:space="preserve">(تونل فقط در بازی چندرنگ است؛ بازی تک‌رنگ تونل ندارد.) بازیکنی که عقب افتاده می‌تواند با خرج امتیاز از تونل، میان‌بری امن از وسط یک دالان به وسط دالانی جلوتر برود.</w:t>
       </w:r>
     </w:p>
     <w:p>

</xml_diff>